<commit_message>
Add documentation and project screenshots
</commit_message>
<xml_diff>
--- a/docs/Task_2_Report.docx
+++ b/docs/Task_2_Report.docx
@@ -15,7 +15,7 @@
           <w:szCs w:val="46"/>
         </w:rPr>
       </w:pPr>
-      <w:bookmarkStart w:colFirst="0" w:colLast="0" w:name="_hv66j5d0jr81" w:id="0"/>
+      <w:bookmarkStart w:colFirst="0" w:colLast="0" w:name="_y1qbf5ghm8u8" w:id="0"/>
       <w:bookmarkEnd w:id="0"/>
       <w:r>
         <w:rPr>
@@ -25,7 +25,7 @@
           <w:szCs w:val="46"/>
           <w:rtl w:val="0"/>
         </w:rPr>
-        <w:t xml:space="preserve">Task 2 Report</w:t>
+        <w:t xml:space="preserve">Task Manager</w:t>
       </w:r>
     </w:p>
     <w:p>
@@ -41,7 +41,7 @@
           <w:szCs w:val="34"/>
         </w:rPr>
       </w:pPr>
-      <w:bookmarkStart w:colFirst="0" w:colLast="0" w:name="_cusjfzwlkdk6" w:id="1"/>
+      <w:bookmarkStart w:colFirst="0" w:colLast="0" w:name="_i8799g858pp3" w:id="1"/>
       <w:bookmarkEnd w:id="1"/>
       <w:r>
         <w:rPr>
@@ -51,13 +51,16 @@
           <w:szCs w:val="34"/>
           <w:rtl w:val="0"/>
         </w:rPr>
-        <w:t xml:space="preserve">Cross-Platform Utility Application with Local Storage</w:t>
-      </w:r>
-    </w:p>
-    <w:p>
-      <w:pPr>
-        <w:spacing w:after="240" w:before="240" w:lineRule="auto"/>
-        <w:rPr/>
+        <w:t xml:space="preserve">Project Report</w:t>
+      </w:r>
+    </w:p>
+    <w:p>
+      <w:pPr>
+        <w:spacing w:after="240" w:before="240" w:lineRule="auto"/>
+        <w:rPr>
+          <w:b w:val="1"/>
+          <w:bCs w:val="1"/>
+        </w:rPr>
       </w:pPr>
       <w:r>
         <w:rPr>
@@ -163,9 +166,15 @@
         </w:rPr>
         <w:t xml:space="preserve"> BLoC / Cubit</w:t>
       </w:r>
-    </w:p>
-    <w:p>
-      <w:pPr>
+      <w:r>
+        <w:rPr>
+          <w:rtl w:val="0"/>
+        </w:rPr>
+      </w:r>
+    </w:p>
+    <w:p>
+      <w:pPr>
+        <w:spacing w:after="240" w:before="240" w:lineRule="auto"/>
         <w:rPr/>
       </w:pPr>
       <w:r>
@@ -192,7 +201,7 @@
           <w:szCs w:val="34"/>
         </w:rPr>
       </w:pPr>
-      <w:bookmarkStart w:colFirst="0" w:colLast="0" w:name="_x22ul5uwnr" w:id="2"/>
+      <w:bookmarkStart w:colFirst="0" w:colLast="0" w:name="_74comh2crumv" w:id="2"/>
       <w:bookmarkEnd w:id="2"/>
       <w:r>
         <w:rPr>
@@ -202,35 +211,48 @@
           <w:szCs w:val="34"/>
           <w:rtl w:val="0"/>
         </w:rPr>
-        <w:t xml:space="preserve">1. Objective</w:t>
-      </w:r>
-    </w:p>
-    <w:p>
-      <w:pPr>
-        <w:spacing w:after="240" w:before="240" w:lineRule="auto"/>
-        <w:rPr/>
-      </w:pPr>
-      <w:r>
-        <w:rPr>
-          <w:rtl w:val="0"/>
-        </w:rPr>
-        <w:t xml:space="preserve">The objective of this task was to develop a functional cross-platform mobile application capable of performing CRUD operations using a local data storage solution.</w:t>
-      </w:r>
-    </w:p>
-    <w:p>
-      <w:pPr>
-        <w:spacing w:after="240" w:before="240" w:lineRule="auto"/>
-        <w:rPr/>
-      </w:pPr>
-      <w:r>
-        <w:rPr>
-          <w:rtl w:val="0"/>
-        </w:rPr>
-        <w:t xml:space="preserve">The application was designed as a Task Manager that allows users to create, view, update, delete, search, filter, and manage their tasks.</w:t>
-      </w:r>
-    </w:p>
-    <w:p>
-      <w:pPr>
+        <w:t xml:space="preserve">1. Project Overview</w:t>
+      </w:r>
+    </w:p>
+    <w:p>
+      <w:pPr>
+        <w:spacing w:after="240" w:before="240" w:lineRule="auto"/>
+        <w:rPr/>
+      </w:pPr>
+      <w:r>
+        <w:rPr>
+          <w:rtl w:val="0"/>
+        </w:rPr>
+        <w:t xml:space="preserve">Task Manager is a cross-platform mobile application developed using Flutter.</w:t>
+      </w:r>
+    </w:p>
+    <w:p>
+      <w:pPr>
+        <w:spacing w:after="240" w:before="240" w:lineRule="auto"/>
+        <w:rPr/>
+      </w:pPr>
+      <w:r>
+        <w:rPr>
+          <w:rtl w:val="0"/>
+        </w:rPr>
+        <w:t xml:space="preserve">The application helps users organize and manage their tasks through a simple and responsive interface. Users can create, view, update, delete, search, filter, and complete tasks.</w:t>
+      </w:r>
+    </w:p>
+    <w:p>
+      <w:pPr>
+        <w:spacing w:after="240" w:before="240" w:lineRule="auto"/>
+        <w:rPr/>
+      </w:pPr>
+      <w:r>
+        <w:rPr>
+          <w:rtl w:val="0"/>
+        </w:rPr>
+        <w:t xml:space="preserve">Task data is stored locally on the device using Hive, allowing the application to maintain data without requiring an internet connection.</w:t>
+      </w:r>
+    </w:p>
+    <w:p>
+      <w:pPr>
+        <w:spacing w:after="240" w:before="240" w:lineRule="auto"/>
         <w:rPr/>
       </w:pPr>
       <w:r>
@@ -257,7 +279,7 @@
           <w:szCs w:val="34"/>
         </w:rPr>
       </w:pPr>
-      <w:bookmarkStart w:colFirst="0" w:colLast="0" w:name="_ha8rscju3ij6" w:id="3"/>
+      <w:bookmarkStart w:colFirst="0" w:colLast="0" w:name="_f8b9ro0v99e" w:id="3"/>
       <w:bookmarkEnd w:id="3"/>
       <w:r>
         <w:rPr>
@@ -267,47 +289,152 @@
           <w:szCs w:val="34"/>
           <w:rtl w:val="0"/>
         </w:rPr>
-        <w:t xml:space="preserve">2. Application Overview</w:t>
-      </w:r>
-    </w:p>
-    <w:p>
-      <w:pPr>
-        <w:spacing w:after="240" w:before="240" w:lineRule="auto"/>
-        <w:rPr/>
-      </w:pPr>
-      <w:r>
-        <w:rPr>
-          <w:rtl w:val="0"/>
-        </w:rPr>
-        <w:t xml:space="preserve">Task Manager is a mobile application developed using Flutter.</w:t>
-      </w:r>
-    </w:p>
-    <w:p>
-      <w:pPr>
-        <w:spacing w:after="240" w:before="240" w:lineRule="auto"/>
-        <w:rPr/>
-      </w:pPr>
-      <w:r>
-        <w:rPr>
-          <w:rtl w:val="0"/>
-        </w:rPr>
-        <w:t xml:space="preserve">The application provides users with a simple interface for managing their daily tasks. Each task can contain a title, description, creation date, due date, and completion status.</w:t>
-      </w:r>
-    </w:p>
-    <w:p>
-      <w:pPr>
-        <w:spacing w:after="240" w:before="240" w:lineRule="auto"/>
-        <w:rPr/>
-      </w:pPr>
-      <w:r>
-        <w:rPr>
-          <w:rtl w:val="0"/>
-        </w:rPr>
-        <w:t xml:space="preserve">All task data is stored locally on the device using Hive, allowing the application to work without requiring an internet connection.</w:t>
-      </w:r>
-    </w:p>
-    <w:p>
-      <w:pPr>
+        <w:t xml:space="preserve">2. Objectives</w:t>
+      </w:r>
+    </w:p>
+    <w:p>
+      <w:pPr>
+        <w:spacing w:after="240" w:before="240" w:lineRule="auto"/>
+        <w:rPr/>
+      </w:pPr>
+      <w:r>
+        <w:rPr>
+          <w:rtl w:val="0"/>
+        </w:rPr>
+        <w:t xml:space="preserve">The main objectives of the project were to:</w:t>
+      </w:r>
+    </w:p>
+    <w:p>
+      <w:pPr>
+        <w:numPr>
+          <w:ilvl w:val="0"/>
+          <w:numId w:val="3"/>
+        </w:numPr>
+        <w:spacing w:after="0" w:afterAutospacing="0" w:before="240" w:lineRule="auto"/>
+        <w:ind w:left="720" w:hanging="360"/>
+      </w:pPr>
+      <w:r>
+        <w:rPr>
+          <w:rtl w:val="0"/>
+        </w:rPr>
+        <w:t xml:space="preserve">Build a functional cross-platform Flutter application.</w:t>
+      </w:r>
+    </w:p>
+    <w:p>
+      <w:pPr>
+        <w:numPr>
+          <w:ilvl w:val="0"/>
+          <w:numId w:val="3"/>
+        </w:numPr>
+        <w:spacing w:after="0" w:afterAutospacing="0" w:before="0" w:beforeAutospacing="0" w:lineRule="auto"/>
+        <w:ind w:left="720" w:hanging="360"/>
+      </w:pPr>
+      <w:r>
+        <w:rPr>
+          <w:rtl w:val="0"/>
+        </w:rPr>
+        <w:t xml:space="preserve">Implement complete CRUD operations.</w:t>
+      </w:r>
+    </w:p>
+    <w:p>
+      <w:pPr>
+        <w:numPr>
+          <w:ilvl w:val="0"/>
+          <w:numId w:val="3"/>
+        </w:numPr>
+        <w:spacing w:after="0" w:afterAutospacing="0" w:before="0" w:beforeAutospacing="0" w:lineRule="auto"/>
+        <w:ind w:left="720" w:hanging="360"/>
+      </w:pPr>
+      <w:r>
+        <w:rPr>
+          <w:rtl w:val="0"/>
+        </w:rPr>
+        <w:t xml:space="preserve">Store application data locally.</w:t>
+      </w:r>
+    </w:p>
+    <w:p>
+      <w:pPr>
+        <w:numPr>
+          <w:ilvl w:val="0"/>
+          <w:numId w:val="3"/>
+        </w:numPr>
+        <w:spacing w:after="0" w:afterAutospacing="0" w:before="0" w:beforeAutospacing="0" w:lineRule="auto"/>
+        <w:ind w:left="720" w:hanging="360"/>
+      </w:pPr>
+      <w:r>
+        <w:rPr>
+          <w:rtl w:val="0"/>
+        </w:rPr>
+        <w:t xml:space="preserve">Implement state management using Cubit.</w:t>
+      </w:r>
+    </w:p>
+    <w:p>
+      <w:pPr>
+        <w:numPr>
+          <w:ilvl w:val="0"/>
+          <w:numId w:val="3"/>
+        </w:numPr>
+        <w:spacing w:after="0" w:afterAutospacing="0" w:before="0" w:beforeAutospacing="0" w:lineRule="auto"/>
+        <w:ind w:left="720" w:hanging="360"/>
+      </w:pPr>
+      <w:r>
+        <w:rPr>
+          <w:rtl w:val="0"/>
+        </w:rPr>
+        <w:t xml:space="preserve">Create a responsive user interface.</w:t>
+      </w:r>
+    </w:p>
+    <w:p>
+      <w:pPr>
+        <w:numPr>
+          <w:ilvl w:val="0"/>
+          <w:numId w:val="3"/>
+        </w:numPr>
+        <w:spacing w:after="0" w:afterAutospacing="0" w:before="0" w:beforeAutospacing="0" w:lineRule="auto"/>
+        <w:ind w:left="720" w:hanging="360"/>
+      </w:pPr>
+      <w:r>
+        <w:rPr>
+          <w:rtl w:val="0"/>
+        </w:rPr>
+        <w:t xml:space="preserve">Provide search and filtering functionality.</w:t>
+      </w:r>
+    </w:p>
+    <w:p>
+      <w:pPr>
+        <w:numPr>
+          <w:ilvl w:val="0"/>
+          <w:numId w:val="3"/>
+        </w:numPr>
+        <w:spacing w:after="0" w:afterAutospacing="0" w:before="0" w:beforeAutospacing="0" w:lineRule="auto"/>
+        <w:ind w:left="720" w:hanging="360"/>
+      </w:pPr>
+      <w:r>
+        <w:rPr>
+          <w:rtl w:val="0"/>
+        </w:rPr>
+        <w:t xml:space="preserve">Support Light and Dark Mode.</w:t>
+      </w:r>
+    </w:p>
+    <w:p>
+      <w:pPr>
+        <w:numPr>
+          <w:ilvl w:val="0"/>
+          <w:numId w:val="3"/>
+        </w:numPr>
+        <w:spacing w:after="240" w:before="0" w:beforeAutospacing="0" w:lineRule="auto"/>
+        <w:ind w:left="720" w:hanging="360"/>
+      </w:pPr>
+      <w:r>
+        <w:rPr>
+          <w:rtl w:val="0"/>
+        </w:rPr>
+        <w:t xml:space="preserve">Preserve the user's theme preference after restarting the application.</w:t>
+      </w:r>
+    </w:p>
+    <w:p>
+      <w:pPr>
+        <w:spacing w:after="240" w:before="240" w:lineRule="auto"/>
         <w:rPr/>
       </w:pPr>
       <w:r>
@@ -334,7 +461,7 @@
           <w:szCs w:val="34"/>
         </w:rPr>
       </w:pPr>
-      <w:bookmarkStart w:colFirst="0" w:colLast="0" w:name="_32708boa3yjn" w:id="4"/>
+      <w:bookmarkStart w:colFirst="0" w:colLast="0" w:name="_sgoc0cg72rjx" w:id="4"/>
       <w:bookmarkEnd w:id="4"/>
       <w:r>
         <w:rPr>
@@ -361,7 +488,7 @@
           <w:szCs w:val="26"/>
         </w:rPr>
       </w:pPr>
-      <w:bookmarkStart w:colFirst="0" w:colLast="0" w:name="_khpl9qqpyy21" w:id="5"/>
+      <w:bookmarkStart w:colFirst="0" w:colLast="0" w:name="_76iw28zej9za" w:id="5"/>
       <w:bookmarkEnd w:id="5"/>
       <w:r>
         <w:rPr>
@@ -384,7 +511,7 @@
         <w:rPr>
           <w:rtl w:val="0"/>
         </w:rPr>
-        <w:t xml:space="preserve">Flutter was used to develop the cross-platform mobile application and build the user interface.</w:t>
+        <w:t xml:space="preserve">Used to build the cross-platform mobile application and user interface.</w:t>
       </w:r>
     </w:p>
     <w:p>
@@ -401,7 +528,7 @@
           <w:szCs w:val="26"/>
         </w:rPr>
       </w:pPr>
-      <w:bookmarkStart w:colFirst="0" w:colLast="0" w:name="_slxp25gjzkmf" w:id="6"/>
+      <w:bookmarkStart w:colFirst="0" w:colLast="0" w:name="_wq9ebkos8waa" w:id="6"/>
       <w:bookmarkEnd w:id="6"/>
       <w:r>
         <w:rPr>
@@ -424,7 +551,7 @@
         <w:rPr>
           <w:rtl w:val="0"/>
         </w:rPr>
-        <w:t xml:space="preserve">Dart was used as the main programming language.</w:t>
+        <w:t xml:space="preserve">Used as the main programming language.</w:t>
       </w:r>
     </w:p>
     <w:p>
@@ -441,7 +568,7 @@
           <w:szCs w:val="26"/>
         </w:rPr>
       </w:pPr>
-      <w:bookmarkStart w:colFirst="0" w:colLast="0" w:name="_jksvjouwyll8" w:id="7"/>
+      <w:bookmarkStart w:colFirst="0" w:colLast="0" w:name="_twrhcg7j5m3h" w:id="7"/>
       <w:bookmarkEnd w:id="7"/>
       <w:r>
         <w:rPr>
@@ -464,7 +591,7 @@
         <w:rPr>
           <w:rtl w:val="0"/>
         </w:rPr>
-        <w:t xml:space="preserve">Hive was used as the local NoSQL database for storing task data on the device.</w:t>
+        <w:t xml:space="preserve">Used as the local NoSQL database for storing tasks.</w:t>
       </w:r>
     </w:p>
     <w:p>
@@ -481,7 +608,7 @@
           <w:szCs w:val="26"/>
         </w:rPr>
       </w:pPr>
-      <w:bookmarkStart w:colFirst="0" w:colLast="0" w:name="_1w0vdel3kapp" w:id="8"/>
+      <w:bookmarkStart w:colFirst="0" w:colLast="0" w:name="_m2rrvvfi4nqs" w:id="8"/>
       <w:bookmarkEnd w:id="8"/>
       <w:r>
         <w:rPr>
@@ -504,7 +631,7 @@
         <w:rPr>
           <w:rtl w:val="0"/>
         </w:rPr>
-        <w:t xml:space="preserve">SharedPreferences was used to save the user's selected Light/Dark Mode preference.</w:t>
+        <w:t xml:space="preserve">Used to save and restore the user's selected theme.</w:t>
       </w:r>
     </w:p>
     <w:p>
@@ -521,7 +648,7 @@
           <w:szCs w:val="26"/>
         </w:rPr>
       </w:pPr>
-      <w:bookmarkStart w:colFirst="0" w:colLast="0" w:name="_f5rv8c6e4dq1" w:id="9"/>
+      <w:bookmarkStart w:colFirst="0" w:colLast="0" w:name="_jba15m536zfg" w:id="9"/>
       <w:bookmarkEnd w:id="9"/>
       <w:r>
         <w:rPr>
@@ -544,7 +671,7 @@
         <w:rPr>
           <w:rtl w:val="0"/>
         </w:rPr>
-        <w:t xml:space="preserve">Cubit was used for state management and handling task operations between the UI, repository, and local database.</w:t>
+        <w:t xml:space="preserve">Used to manage application state and handle task operations.</w:t>
       </w:r>
     </w:p>
     <w:p>
@@ -561,7 +688,7 @@
           <w:szCs w:val="26"/>
         </w:rPr>
       </w:pPr>
-      <w:bookmarkStart w:colFirst="0" w:colLast="0" w:name="_kgrgg5n0i39t" w:id="10"/>
+      <w:bookmarkStart w:colFirst="0" w:colLast="0" w:name="_vznvexvlp4fo" w:id="10"/>
       <w:bookmarkEnd w:id="10"/>
       <w:r>
         <w:rPr>
@@ -584,11 +711,12 @@
         <w:rPr>
           <w:rtl w:val="0"/>
         </w:rPr>
-        <w:t xml:space="preserve">Material 3 components were used to create a modern and responsive user interface.</w:t>
-      </w:r>
-    </w:p>
-    <w:p>
-      <w:pPr>
+        <w:t xml:space="preserve">Used to build the application's user interface and components.</w:t>
+      </w:r>
+    </w:p>
+    <w:p>
+      <w:pPr>
+        <w:spacing w:after="240" w:before="240" w:lineRule="auto"/>
         <w:rPr/>
       </w:pPr>
       <w:r>
@@ -615,7 +743,7 @@
           <w:szCs w:val="34"/>
         </w:rPr>
       </w:pPr>
-      <w:bookmarkStart w:colFirst="0" w:colLast="0" w:name="_vmjjn94ldykx" w:id="11"/>
+      <w:bookmarkStart w:colFirst="0" w:colLast="0" w:name="_ml8fmt3lao2m" w:id="11"/>
       <w:bookmarkEnd w:id="11"/>
       <w:r>
         <w:rPr>
@@ -637,14 +765,14 @@
         <w:rPr>
           <w:rtl w:val="0"/>
         </w:rPr>
-        <w:t xml:space="preserve">The application includes the following features:</w:t>
-      </w:r>
-    </w:p>
-    <w:p>
-      <w:pPr>
-        <w:numPr>
-          <w:ilvl w:val="0"/>
-          <w:numId w:val="2"/>
+        <w:t xml:space="preserve">The application provides:</w:t>
+      </w:r>
+    </w:p>
+    <w:p>
+      <w:pPr>
+        <w:numPr>
+          <w:ilvl w:val="0"/>
+          <w:numId w:val="7"/>
         </w:numPr>
         <w:spacing w:after="0" w:afterAutospacing="0" w:before="240" w:lineRule="auto"/>
         <w:ind w:left="720" w:hanging="360"/>
@@ -653,14 +781,14 @@
         <w:rPr>
           <w:rtl w:val="0"/>
         </w:rPr>
-        <w:t xml:space="preserve">Create new tasks</w:t>
-      </w:r>
-    </w:p>
-    <w:p>
-      <w:pPr>
-        <w:numPr>
-          <w:ilvl w:val="0"/>
-          <w:numId w:val="2"/>
+        <w:t xml:space="preserve">Create new tasks.</w:t>
+      </w:r>
+    </w:p>
+    <w:p>
+      <w:pPr>
+        <w:numPr>
+          <w:ilvl w:val="0"/>
+          <w:numId w:val="7"/>
         </w:numPr>
         <w:spacing w:after="0" w:afterAutospacing="0" w:before="0" w:beforeAutospacing="0" w:lineRule="auto"/>
         <w:ind w:left="720" w:hanging="360"/>
@@ -669,14 +797,14 @@
         <w:rPr>
           <w:rtl w:val="0"/>
         </w:rPr>
-        <w:t xml:space="preserve">View saved tasks</w:t>
-      </w:r>
-    </w:p>
-    <w:p>
-      <w:pPr>
-        <w:numPr>
-          <w:ilvl w:val="0"/>
-          <w:numId w:val="2"/>
+        <w:t xml:space="preserve">View saved tasks.</w:t>
+      </w:r>
+    </w:p>
+    <w:p>
+      <w:pPr>
+        <w:numPr>
+          <w:ilvl w:val="0"/>
+          <w:numId w:val="7"/>
         </w:numPr>
         <w:spacing w:after="0" w:afterAutospacing="0" w:before="0" w:beforeAutospacing="0" w:lineRule="auto"/>
         <w:ind w:left="720" w:hanging="360"/>
@@ -685,14 +813,14 @@
         <w:rPr>
           <w:rtl w:val="0"/>
         </w:rPr>
-        <w:t xml:space="preserve">Edit existing tasks</w:t>
-      </w:r>
-    </w:p>
-    <w:p>
-      <w:pPr>
-        <w:numPr>
-          <w:ilvl w:val="0"/>
-          <w:numId w:val="2"/>
+        <w:t xml:space="preserve">Edit existing tasks.</w:t>
+      </w:r>
+    </w:p>
+    <w:p>
+      <w:pPr>
+        <w:numPr>
+          <w:ilvl w:val="0"/>
+          <w:numId w:val="7"/>
         </w:numPr>
         <w:spacing w:after="0" w:afterAutospacing="0" w:before="0" w:beforeAutospacing="0" w:lineRule="auto"/>
         <w:ind w:left="720" w:hanging="360"/>
@@ -701,14 +829,14 @@
         <w:rPr>
           <w:rtl w:val="0"/>
         </w:rPr>
-        <w:t xml:space="preserve">Delete tasks</w:t>
-      </w:r>
-    </w:p>
-    <w:p>
-      <w:pPr>
-        <w:numPr>
-          <w:ilvl w:val="0"/>
-          <w:numId w:val="2"/>
+        <w:t xml:space="preserve">Delete tasks with confirmation.</w:t>
+      </w:r>
+    </w:p>
+    <w:p>
+      <w:pPr>
+        <w:numPr>
+          <w:ilvl w:val="0"/>
+          <w:numId w:val="7"/>
         </w:numPr>
         <w:spacing w:after="0" w:afterAutospacing="0" w:before="0" w:beforeAutospacing="0" w:lineRule="auto"/>
         <w:ind w:left="720" w:hanging="360"/>
@@ -717,14 +845,14 @@
         <w:rPr>
           <w:rtl w:val="0"/>
         </w:rPr>
-        <w:t xml:space="preserve">Mark tasks as completed</w:t>
-      </w:r>
-    </w:p>
-    <w:p>
-      <w:pPr>
-        <w:numPr>
-          <w:ilvl w:val="0"/>
-          <w:numId w:val="2"/>
+        <w:t xml:space="preserve">Mark tasks as completed.</w:t>
+      </w:r>
+    </w:p>
+    <w:p>
+      <w:pPr>
+        <w:numPr>
+          <w:ilvl w:val="0"/>
+          <w:numId w:val="7"/>
         </w:numPr>
         <w:spacing w:after="0" w:afterAutospacing="0" w:before="0" w:beforeAutospacing="0" w:lineRule="auto"/>
         <w:ind w:left="720" w:hanging="360"/>
@@ -733,14 +861,14 @@
         <w:rPr>
           <w:rtl w:val="0"/>
         </w:rPr>
-        <w:t xml:space="preserve">Set task due dates</w:t>
-      </w:r>
-    </w:p>
-    <w:p>
-      <w:pPr>
-        <w:numPr>
-          <w:ilvl w:val="0"/>
-          <w:numId w:val="2"/>
+        <w:t xml:space="preserve">Set task due dates.</w:t>
+      </w:r>
+    </w:p>
+    <w:p>
+      <w:pPr>
+        <w:numPr>
+          <w:ilvl w:val="0"/>
+          <w:numId w:val="7"/>
         </w:numPr>
         <w:spacing w:after="0" w:afterAutospacing="0" w:before="0" w:beforeAutospacing="0" w:lineRule="auto"/>
         <w:ind w:left="720" w:hanging="360"/>
@@ -749,14 +877,14 @@
         <w:rPr>
           <w:rtl w:val="0"/>
         </w:rPr>
-        <w:t xml:space="preserve">Search tasks</w:t>
-      </w:r>
-    </w:p>
-    <w:p>
-      <w:pPr>
-        <w:numPr>
-          <w:ilvl w:val="0"/>
-          <w:numId w:val="2"/>
+        <w:t xml:space="preserve">Search by task title or description.</w:t>
+      </w:r>
+    </w:p>
+    <w:p>
+      <w:pPr>
+        <w:numPr>
+          <w:ilvl w:val="0"/>
+          <w:numId w:val="7"/>
         </w:numPr>
         <w:spacing w:after="0" w:afterAutospacing="0" w:before="0" w:beforeAutospacing="0" w:lineRule="auto"/>
         <w:ind w:left="720" w:hanging="360"/>
@@ -765,14 +893,14 @@
         <w:rPr>
           <w:rtl w:val="0"/>
         </w:rPr>
-        <w:t xml:space="preserve">Filter tasks</w:t>
-      </w:r>
-    </w:p>
-    <w:p>
-      <w:pPr>
-        <w:numPr>
-          <w:ilvl w:val="0"/>
-          <w:numId w:val="2"/>
+        <w:t xml:space="preserve">Filter tasks by All, Pending, and Completed.</w:t>
+      </w:r>
+    </w:p>
+    <w:p>
+      <w:pPr>
+        <w:numPr>
+          <w:ilvl w:val="0"/>
+          <w:numId w:val="7"/>
         </w:numPr>
         <w:spacing w:after="0" w:afterAutospacing="0" w:before="0" w:beforeAutospacing="0" w:lineRule="auto"/>
         <w:ind w:left="720" w:hanging="360"/>
@@ -781,14 +909,14 @@
         <w:rPr>
           <w:rtl w:val="0"/>
         </w:rPr>
-        <w:t xml:space="preserve">Light Mode</w:t>
-      </w:r>
-    </w:p>
-    <w:p>
-      <w:pPr>
-        <w:numPr>
-          <w:ilvl w:val="0"/>
-          <w:numId w:val="2"/>
+        <w:t xml:space="preserve">Light Mode.</w:t>
+      </w:r>
+    </w:p>
+    <w:p>
+      <w:pPr>
+        <w:numPr>
+          <w:ilvl w:val="0"/>
+          <w:numId w:val="7"/>
         </w:numPr>
         <w:spacing w:after="0" w:afterAutospacing="0" w:before="0" w:beforeAutospacing="0" w:lineRule="auto"/>
         <w:ind w:left="720" w:hanging="360"/>
@@ -797,14 +925,14 @@
         <w:rPr>
           <w:rtl w:val="0"/>
         </w:rPr>
-        <w:t xml:space="preserve">Dark Mode</w:t>
-      </w:r>
-    </w:p>
-    <w:p>
-      <w:pPr>
-        <w:numPr>
-          <w:ilvl w:val="0"/>
-          <w:numId w:val="2"/>
+        <w:t xml:space="preserve">Dark Mode.</w:t>
+      </w:r>
+    </w:p>
+    <w:p>
+      <w:pPr>
+        <w:numPr>
+          <w:ilvl w:val="0"/>
+          <w:numId w:val="7"/>
         </w:numPr>
         <w:spacing w:after="0" w:afterAutospacing="0" w:before="0" w:beforeAutospacing="0" w:lineRule="auto"/>
         <w:ind w:left="720" w:hanging="360"/>
@@ -813,14 +941,14 @@
         <w:rPr>
           <w:rtl w:val="0"/>
         </w:rPr>
-        <w:t xml:space="preserve">Persistent theme preference</w:t>
-      </w:r>
-    </w:p>
-    <w:p>
-      <w:pPr>
-        <w:numPr>
-          <w:ilvl w:val="0"/>
-          <w:numId w:val="2"/>
+        <w:t xml:space="preserve">Persistent theme preference.</w:t>
+      </w:r>
+    </w:p>
+    <w:p>
+      <w:pPr>
+        <w:numPr>
+          <w:ilvl w:val="0"/>
+          <w:numId w:val="7"/>
         </w:numPr>
         <w:spacing w:after="0" w:afterAutospacing="0" w:before="0" w:beforeAutospacing="0" w:lineRule="auto"/>
         <w:ind w:left="720" w:hanging="360"/>
@@ -829,14 +957,14 @@
         <w:rPr>
           <w:rtl w:val="0"/>
         </w:rPr>
-        <w:t xml:space="preserve">Responsive user interface</w:t>
-      </w:r>
-    </w:p>
-    <w:p>
-      <w:pPr>
-        <w:numPr>
-          <w:ilvl w:val="0"/>
-          <w:numId w:val="2"/>
+        <w:t xml:space="preserve">Responsive user interface.</w:t>
+      </w:r>
+    </w:p>
+    <w:p>
+      <w:pPr>
+        <w:numPr>
+          <w:ilvl w:val="0"/>
+          <w:numId w:val="7"/>
         </w:numPr>
         <w:spacing w:after="240" w:before="0" w:beforeAutospacing="0" w:lineRule="auto"/>
         <w:ind w:left="720" w:hanging="360"/>
@@ -845,11 +973,12 @@
         <w:rPr>
           <w:rtl w:val="0"/>
         </w:rPr>
-        <w:t xml:space="preserve">Local data persistence</w:t>
-      </w:r>
-    </w:p>
-    <w:p>
-      <w:pPr>
+        <w:t xml:space="preserve">Local data persistence.</w:t>
+      </w:r>
+    </w:p>
+    <w:p>
+      <w:pPr>
+        <w:spacing w:after="240" w:before="240" w:lineRule="auto"/>
         <w:rPr/>
       </w:pPr>
       <w:r>
@@ -876,7 +1005,7 @@
           <w:szCs w:val="34"/>
         </w:rPr>
       </w:pPr>
-      <w:bookmarkStart w:colFirst="0" w:colLast="0" w:name="_c4j2do9gbi7l" w:id="12"/>
+      <w:bookmarkStart w:colFirst="0" w:colLast="0" w:name="_jp6qo9hiku1i" w:id="12"/>
       <w:bookmarkEnd w:id="12"/>
       <w:r>
         <w:rPr>
@@ -886,7 +1015,7 @@
           <w:szCs w:val="34"/>
           <w:rtl w:val="0"/>
         </w:rPr>
-        <w:t xml:space="preserve">5. CRUD Implementation</w:t>
+        <w:t xml:space="preserve">5. CRUD Operations</w:t>
       </w:r>
     </w:p>
     <w:p>
@@ -903,7 +1032,7 @@
           <w:szCs w:val="26"/>
         </w:rPr>
       </w:pPr>
-      <w:bookmarkStart w:colFirst="0" w:colLast="0" w:name="_ckapjhq16kxs" w:id="13"/>
+      <w:bookmarkStart w:colFirst="0" w:colLast="0" w:name="_7zkgw8l7xp1e" w:id="13"/>
       <w:bookmarkEnd w:id="13"/>
       <w:r>
         <w:rPr>
@@ -926,67 +1055,19 @@
         <w:rPr>
           <w:rtl w:val="0"/>
         </w:rPr>
-        <w:t xml:space="preserve">Users can create a task by entering:</w:t>
-      </w:r>
-    </w:p>
-    <w:p>
-      <w:pPr>
-        <w:numPr>
-          <w:ilvl w:val="0"/>
-          <w:numId w:val="5"/>
-        </w:numPr>
-        <w:spacing w:after="0" w:afterAutospacing="0" w:before="240" w:lineRule="auto"/>
-        <w:ind w:left="720" w:hanging="360"/>
-      </w:pPr>
-      <w:r>
-        <w:rPr>
-          <w:rtl w:val="0"/>
-        </w:rPr>
-        <w:t xml:space="preserve">Task title</w:t>
-      </w:r>
-    </w:p>
-    <w:p>
-      <w:pPr>
-        <w:numPr>
-          <w:ilvl w:val="0"/>
-          <w:numId w:val="5"/>
-        </w:numPr>
-        <w:spacing w:after="0" w:afterAutospacing="0" w:before="0" w:beforeAutospacing="0" w:lineRule="auto"/>
-        <w:ind w:left="720" w:hanging="360"/>
-      </w:pPr>
-      <w:r>
-        <w:rPr>
-          <w:rtl w:val="0"/>
-        </w:rPr>
-        <w:t xml:space="preserve">Task description</w:t>
-      </w:r>
-    </w:p>
-    <w:p>
-      <w:pPr>
-        <w:numPr>
-          <w:ilvl w:val="0"/>
-          <w:numId w:val="5"/>
-        </w:numPr>
-        <w:spacing w:after="240" w:before="0" w:beforeAutospacing="0" w:lineRule="auto"/>
-        <w:ind w:left="720" w:hanging="360"/>
-      </w:pPr>
-      <w:r>
-        <w:rPr>
-          <w:rtl w:val="0"/>
-        </w:rPr>
-        <w:t xml:space="preserve">Due date</w:t>
-      </w:r>
-    </w:p>
-    <w:p>
-      <w:pPr>
-        <w:spacing w:after="240" w:before="240" w:lineRule="auto"/>
-        <w:rPr/>
-      </w:pPr>
-      <w:r>
-        <w:rPr>
-          <w:rtl w:val="0"/>
-        </w:rPr>
-        <w:t xml:space="preserve">After pressing the Add Task button, the task is stored in the local Hive database.</w:t>
+        <w:t xml:space="preserve">Users can create a new task by entering a title, description, and due date.</w:t>
+      </w:r>
+    </w:p>
+    <w:p>
+      <w:pPr>
+        <w:spacing w:after="240" w:before="240" w:lineRule="auto"/>
+        <w:rPr/>
+      </w:pPr>
+      <w:r>
+        <w:rPr>
+          <w:rtl w:val="0"/>
+        </w:rPr>
+        <w:t xml:space="preserve">The task is then stored in the local Hive database.</w:t>
       </w:r>
     </w:p>
     <w:p>
@@ -1003,7 +1084,7 @@
           <w:szCs w:val="26"/>
         </w:rPr>
       </w:pPr>
-      <w:bookmarkStart w:colFirst="0" w:colLast="0" w:name="_hhbo9x7kzthd" w:id="14"/>
+      <w:bookmarkStart w:colFirst="0" w:colLast="0" w:name="_y5vukec7xx0i" w:id="14"/>
       <w:bookmarkEnd w:id="14"/>
       <w:r>
         <w:rPr>
@@ -1026,19 +1107,7 @@
         <w:rPr>
           <w:rtl w:val="0"/>
         </w:rPr>
-        <w:t xml:space="preserve">All saved tasks are retrieved from Hive and displayed on the Home Screen.</w:t>
-      </w:r>
-    </w:p>
-    <w:p>
-      <w:pPr>
-        <w:spacing w:after="240" w:before="240" w:lineRule="auto"/>
-        <w:rPr/>
-      </w:pPr>
-      <w:r>
-        <w:rPr>
-          <w:rtl w:val="0"/>
-        </w:rPr>
-        <w:t xml:space="preserve">The application loads the stored tasks when it starts, allowing users to continue using their previously saved data.</w:t>
+        <w:t xml:space="preserve">Saved tasks are retrieved from Hive and displayed on the Home Screen.</w:t>
       </w:r>
     </w:p>
     <w:p>
@@ -1055,7 +1124,7 @@
           <w:szCs w:val="26"/>
         </w:rPr>
       </w:pPr>
-      <w:bookmarkStart w:colFirst="0" w:colLast="0" w:name="_x6k1bciwon6f" w:id="15"/>
+      <w:bookmarkStart w:colFirst="0" w:colLast="0" w:name="_xebt631j4fk7" w:id="15"/>
       <w:bookmarkEnd w:id="15"/>
       <w:r>
         <w:rPr>
@@ -1078,79 +1147,7 @@
         <w:rPr>
           <w:rtl w:val="0"/>
         </w:rPr>
-        <w:t xml:space="preserve">Users can update an existing task by selecting the Edit button.</w:t>
-      </w:r>
-    </w:p>
-    <w:p>
-      <w:pPr>
-        <w:spacing w:after="240" w:before="240" w:lineRule="auto"/>
-        <w:rPr/>
-      </w:pPr>
-      <w:r>
-        <w:rPr>
-          <w:rtl w:val="0"/>
-        </w:rPr>
-        <w:t xml:space="preserve">They can modify:</w:t>
-      </w:r>
-    </w:p>
-    <w:p>
-      <w:pPr>
-        <w:numPr>
-          <w:ilvl w:val="0"/>
-          <w:numId w:val="6"/>
-        </w:numPr>
-        <w:spacing w:after="0" w:afterAutospacing="0" w:before="240" w:lineRule="auto"/>
-        <w:ind w:left="720" w:hanging="360"/>
-      </w:pPr>
-      <w:r>
-        <w:rPr>
-          <w:rtl w:val="0"/>
-        </w:rPr>
-        <w:t xml:space="preserve">Task title</w:t>
-      </w:r>
-    </w:p>
-    <w:p>
-      <w:pPr>
-        <w:numPr>
-          <w:ilvl w:val="0"/>
-          <w:numId w:val="6"/>
-        </w:numPr>
-        <w:spacing w:after="0" w:afterAutospacing="0" w:before="0" w:beforeAutospacing="0" w:lineRule="auto"/>
-        <w:ind w:left="720" w:hanging="360"/>
-      </w:pPr>
-      <w:r>
-        <w:rPr>
-          <w:rtl w:val="0"/>
-        </w:rPr>
-        <w:t xml:space="preserve">Description</w:t>
-      </w:r>
-    </w:p>
-    <w:p>
-      <w:pPr>
-        <w:numPr>
-          <w:ilvl w:val="0"/>
-          <w:numId w:val="6"/>
-        </w:numPr>
-        <w:spacing w:after="240" w:before="0" w:beforeAutospacing="0" w:lineRule="auto"/>
-        <w:ind w:left="720" w:hanging="360"/>
-      </w:pPr>
-      <w:r>
-        <w:rPr>
-          <w:rtl w:val="0"/>
-        </w:rPr>
-        <w:t xml:space="preserve">Due date</w:t>
-      </w:r>
-    </w:p>
-    <w:p>
-      <w:pPr>
-        <w:spacing w:after="240" w:before="240" w:lineRule="auto"/>
-        <w:rPr/>
-      </w:pPr>
-      <w:r>
-        <w:rPr>
-          <w:rtl w:val="0"/>
-        </w:rPr>
-        <w:t xml:space="preserve">Users can also change the completion status of a task.</w:t>
+        <w:t xml:space="preserve">Users can edit existing task information and change the completion status.</w:t>
       </w:r>
     </w:p>
     <w:p>
@@ -1167,7 +1164,7 @@
           <w:szCs w:val="26"/>
         </w:rPr>
       </w:pPr>
-      <w:bookmarkStart w:colFirst="0" w:colLast="0" w:name="_rz3q9i7omvcj" w:id="16"/>
+      <w:bookmarkStart w:colFirst="0" w:colLast="0" w:name="_7oxm008roq7j" w:id="16"/>
       <w:bookmarkEnd w:id="16"/>
       <w:r>
         <w:rPr>
@@ -1190,23 +1187,12 @@
         <w:rPr>
           <w:rtl w:val="0"/>
         </w:rPr>
-        <w:t xml:space="preserve">Users can delete tasks using the Delete button.</w:t>
-      </w:r>
-    </w:p>
-    <w:p>
-      <w:pPr>
-        <w:spacing w:after="240" w:before="240" w:lineRule="auto"/>
-        <w:rPr/>
-      </w:pPr>
-      <w:r>
-        <w:rPr>
-          <w:rtl w:val="0"/>
-        </w:rPr>
-        <w:t xml:space="preserve">A confirmation dialog is displayed before permanently removing the task.</w:t>
-      </w:r>
-    </w:p>
-    <w:p>
-      <w:pPr>
+        <w:t xml:space="preserve">Users can delete an existing task. A confirmation dialog is displayed before deletion.</w:t>
+      </w:r>
+    </w:p>
+    <w:p>
+      <w:pPr>
+        <w:spacing w:after="240" w:before="240" w:lineRule="auto"/>
         <w:rPr/>
       </w:pPr>
       <w:r>
@@ -1233,7 +1219,7 @@
           <w:szCs w:val="34"/>
         </w:rPr>
       </w:pPr>
-      <w:bookmarkStart w:colFirst="0" w:colLast="0" w:name="_iwjwmd4ucvet" w:id="17"/>
+      <w:bookmarkStart w:colFirst="0" w:colLast="0" w:name="_7x6f3tm4trf6" w:id="17"/>
       <w:bookmarkEnd w:id="17"/>
       <w:r>
         <w:rPr>
@@ -1255,19 +1241,7 @@
         <w:rPr>
           <w:rtl w:val="0"/>
         </w:rPr>
-        <w:t xml:space="preserve">Hive was selected as the local database because it is lightweight, fast, and suitable for Flutter applications.</w:t>
-      </w:r>
-    </w:p>
-    <w:p>
-      <w:pPr>
-        <w:spacing w:after="240" w:before="240" w:lineRule="auto"/>
-        <w:rPr/>
-      </w:pPr>
-      <w:r>
-        <w:rPr>
-          <w:rtl w:val="0"/>
-        </w:rPr>
-        <w:t xml:space="preserve">The application stores task objects locally in a Hive box.</w:t>
+        <w:t xml:space="preserve">Hive is used as the local database.</w:t>
       </w:r>
     </w:p>
     <w:p>
@@ -1284,7 +1258,12 @@
     </w:p>
     <w:p>
       <w:pPr>
-        <w:rPr/>
+        <w:numPr>
+          <w:ilvl w:val="0"/>
+          <w:numId w:val="4"/>
+        </w:numPr>
+        <w:spacing w:after="0" w:afterAutospacing="0" w:before="240" w:lineRule="auto"/>
+        <w:ind w:left="720" w:hanging="360"/>
       </w:pPr>
       <w:r>
         <w:rPr>
@@ -1295,7 +1274,12 @@
     </w:p>
     <w:p>
       <w:pPr>
-        <w:rPr/>
+        <w:numPr>
+          <w:ilvl w:val="0"/>
+          <w:numId w:val="4"/>
+        </w:numPr>
+        <w:spacing w:after="0" w:afterAutospacing="0" w:before="0" w:beforeAutospacing="0" w:lineRule="auto"/>
+        <w:ind w:left="720" w:hanging="360"/>
       </w:pPr>
       <w:r>
         <w:rPr>
@@ -1306,7 +1290,12 @@
     </w:p>
     <w:p>
       <w:pPr>
-        <w:rPr/>
+        <w:numPr>
+          <w:ilvl w:val="0"/>
+          <w:numId w:val="4"/>
+        </w:numPr>
+        <w:spacing w:after="0" w:afterAutospacing="0" w:before="0" w:beforeAutospacing="0" w:lineRule="auto"/>
+        <w:ind w:left="720" w:hanging="360"/>
       </w:pPr>
       <w:r>
         <w:rPr>
@@ -1317,18 +1306,28 @@
     </w:p>
     <w:p>
       <w:pPr>
-        <w:rPr/>
-      </w:pPr>
-      <w:r>
-        <w:rPr>
-          <w:rtl w:val="0"/>
-        </w:rPr>
-        <w:t xml:space="preserve">Created Date</w:t>
-      </w:r>
-    </w:p>
-    <w:p>
-      <w:pPr>
-        <w:rPr/>
+        <w:numPr>
+          <w:ilvl w:val="0"/>
+          <w:numId w:val="4"/>
+        </w:numPr>
+        <w:spacing w:after="0" w:afterAutospacing="0" w:before="0" w:beforeAutospacing="0" w:lineRule="auto"/>
+        <w:ind w:left="720" w:hanging="360"/>
+      </w:pPr>
+      <w:r>
+        <w:rPr>
+          <w:rtl w:val="0"/>
+        </w:rPr>
+        <w:t xml:space="preserve">Creation Date</w:t>
+      </w:r>
+    </w:p>
+    <w:p>
+      <w:pPr>
+        <w:numPr>
+          <w:ilvl w:val="0"/>
+          <w:numId w:val="4"/>
+        </w:numPr>
+        <w:spacing w:after="0" w:afterAutospacing="0" w:before="0" w:beforeAutospacing="0" w:lineRule="auto"/>
+        <w:ind w:left="720" w:hanging="360"/>
       </w:pPr>
       <w:r>
         <w:rPr>
@@ -1339,7 +1338,12 @@
     </w:p>
     <w:p>
       <w:pPr>
-        <w:rPr/>
+        <w:numPr>
+          <w:ilvl w:val="0"/>
+          <w:numId w:val="4"/>
+        </w:numPr>
+        <w:spacing w:after="240" w:before="0" w:beforeAutospacing="0" w:lineRule="auto"/>
+        <w:ind w:left="720" w:hanging="360"/>
       </w:pPr>
       <w:r>
         <w:rPr>
@@ -1350,28 +1354,19 @@
     </w:p>
     <w:p>
       <w:pPr>
-        <w:rPr/>
-      </w:pPr>
-      <w:r>
-        <w:rPr>
-          <w:rtl w:val="0"/>
-        </w:rPr>
-      </w:r>
-    </w:p>
-    <w:p>
-      <w:pPr>
-        <w:spacing w:after="240" w:before="240" w:lineRule="auto"/>
-        <w:rPr/>
-      </w:pPr>
-      <w:r>
-        <w:rPr>
-          <w:rtl w:val="0"/>
-        </w:rPr>
-        <w:t xml:space="preserve">The stored data remains available after closing and reopening the application.</w:t>
-      </w:r>
-    </w:p>
-    <w:p>
-      <w:pPr>
+        <w:spacing w:after="240" w:before="240" w:lineRule="auto"/>
+        <w:rPr/>
+      </w:pPr>
+      <w:r>
+        <w:rPr>
+          <w:rtl w:val="0"/>
+        </w:rPr>
+        <w:t xml:space="preserve">The data remains available after closing and reopening the application.</w:t>
+      </w:r>
+    </w:p>
+    <w:p>
+      <w:pPr>
+        <w:spacing w:after="240" w:before="240" w:lineRule="auto"/>
         <w:rPr/>
       </w:pPr>
       <w:r>
@@ -1398,7 +1393,7 @@
           <w:szCs w:val="34"/>
         </w:rPr>
       </w:pPr>
-      <w:bookmarkStart w:colFirst="0" w:colLast="0" w:name="_fnv4xnr5kr60" w:id="18"/>
+      <w:bookmarkStart w:colFirst="0" w:colLast="0" w:name="_rf1cxkjrzr4l" w:id="18"/>
       <w:bookmarkEnd w:id="18"/>
       <w:r>
         <w:rPr>
@@ -1420,23 +1415,24 @@
         <w:rPr>
           <w:rtl w:val="0"/>
         </w:rPr>
-        <w:t xml:space="preserve">Cubit was used to manage the application state.</w:t>
-      </w:r>
-    </w:p>
-    <w:p>
-      <w:pPr>
-        <w:spacing w:after="240" w:before="240" w:lineRule="auto"/>
-        <w:rPr/>
-      </w:pPr>
-      <w:r>
-        <w:rPr>
-          <w:rtl w:val="0"/>
-        </w:rPr>
-        <w:t xml:space="preserve">The general data flow is:</w:t>
-      </w:r>
-    </w:p>
-    <w:p>
-      <w:pPr>
+        <w:t xml:space="preserve">Cubit is used to manage the application's task state.</w:t>
+      </w:r>
+    </w:p>
+    <w:p>
+      <w:pPr>
+        <w:spacing w:after="240" w:before="240" w:lineRule="auto"/>
+        <w:rPr/>
+      </w:pPr>
+      <w:r>
+        <w:rPr>
+          <w:rtl w:val="0"/>
+        </w:rPr>
+        <w:t xml:space="preserve">The application follows this general flow:</w:t>
+      </w:r>
+    </w:p>
+    <w:p>
+      <w:pPr>
+        <w:spacing w:after="240" w:before="240" w:lineRule="auto"/>
         <w:rPr/>
       </w:pPr>
       <w:r>
@@ -1448,6 +1444,7 @@
     </w:p>
     <w:p>
       <w:pPr>
+        <w:spacing w:after="240" w:before="240" w:lineRule="auto"/>
         <w:rPr/>
       </w:pPr>
       <w:r>
@@ -1460,6 +1457,7 @@
     </w:p>
     <w:p>
       <w:pPr>
+        <w:spacing w:after="240" w:before="240" w:lineRule="auto"/>
         <w:rPr/>
       </w:pPr>
       <w:r>
@@ -1471,6 +1469,7 @@
     </w:p>
     <w:p>
       <w:pPr>
+        <w:spacing w:after="240" w:before="240" w:lineRule="auto"/>
         <w:rPr/>
       </w:pPr>
       <w:r>
@@ -1483,6 +1482,7 @@
     </w:p>
     <w:p>
       <w:pPr>
+        <w:spacing w:after="240" w:before="240" w:lineRule="auto"/>
         <w:rPr/>
       </w:pPr>
       <w:r>
@@ -1494,6 +1494,7 @@
     </w:p>
     <w:p>
       <w:pPr>
+        <w:spacing w:after="240" w:before="240" w:lineRule="auto"/>
         <w:rPr/>
       </w:pPr>
       <w:r>
@@ -1506,6 +1507,7 @@
     </w:p>
     <w:p>
       <w:pPr>
+        <w:spacing w:after="240" w:before="240" w:lineRule="auto"/>
         <w:rPr/>
       </w:pPr>
       <w:r>
@@ -1517,6 +1519,7 @@
     </w:p>
     <w:p>
       <w:pPr>
+        <w:spacing w:after="240" w:before="240" w:lineRule="auto"/>
         <w:rPr/>
       </w:pPr>
       <w:r>
@@ -1529,39 +1532,42 @@
     </w:p>
     <w:p>
       <w:pPr>
-        <w:rPr/>
-      </w:pPr>
-      <w:r>
-        <w:rPr>
-          <w:rtl w:val="0"/>
-        </w:rPr>
-        <w:t xml:space="preserve"> Local Database</w:t>
-      </w:r>
-    </w:p>
-    <w:p>
-      <w:pPr>
-        <w:rPr/>
-      </w:pPr>
-      <w:r>
-        <w:rPr>
-          <w:rtl w:val="0"/>
-        </w:rPr>
-      </w:r>
-    </w:p>
-    <w:p>
-      <w:pPr>
-        <w:spacing w:after="240" w:before="240" w:lineRule="auto"/>
-        <w:rPr/>
-      </w:pPr>
-      <w:r>
-        <w:rPr>
-          <w:rtl w:val="0"/>
-        </w:rPr>
-        <w:t xml:space="preserve">When a task is added, updated, or deleted, the Cubit updates the application state and the UI automatically reflects the changes.</w:t>
-      </w:r>
-    </w:p>
-    <w:p>
-      <w:pPr>
+        <w:spacing w:after="240" w:before="240" w:lineRule="auto"/>
+        <w:rPr/>
+      </w:pPr>
+      <w:r>
+        <w:rPr>
+          <w:rtl w:val="0"/>
+        </w:rPr>
+        <w:t xml:space="preserve">Local Database</w:t>
+      </w:r>
+    </w:p>
+    <w:p>
+      <w:pPr>
+        <w:spacing w:after="240" w:before="240" w:lineRule="auto"/>
+        <w:rPr/>
+      </w:pPr>
+      <w:r>
+        <w:rPr>
+          <w:rtl w:val="0"/>
+        </w:rPr>
+      </w:r>
+    </w:p>
+    <w:p>
+      <w:pPr>
+        <w:spacing w:after="240" w:before="240" w:lineRule="auto"/>
+        <w:rPr/>
+      </w:pPr>
+      <w:r>
+        <w:rPr>
+          <w:rtl w:val="0"/>
+        </w:rPr>
+        <w:t xml:space="preserve">When a task is added, updated, completed, or deleted, the Cubit updates the application state and the UI reflects the changes.</w:t>
+      </w:r>
+    </w:p>
+    <w:p>
+      <w:pPr>
+        <w:spacing w:after="240" w:before="240" w:lineRule="auto"/>
         <w:rPr/>
       </w:pPr>
       <w:r>
@@ -1588,7 +1594,7 @@
           <w:szCs w:val="34"/>
         </w:rPr>
       </w:pPr>
-      <w:bookmarkStart w:colFirst="0" w:colLast="0" w:name="_rd9iq3aawz1u" w:id="19"/>
+      <w:bookmarkStart w:colFirst="0" w:colLast="0" w:name="_qqc3puilavk6" w:id="19"/>
       <w:bookmarkEnd w:id="19"/>
       <w:r>
         <w:rPr>
@@ -1610,26 +1616,14 @@
         <w:rPr>
           <w:rtl w:val="0"/>
         </w:rPr>
-        <w:t xml:space="preserve">The application provides a search feature that allows users to search for tasks using the task title or description.</w:t>
-      </w:r>
-    </w:p>
-    <w:p>
-      <w:pPr>
-        <w:spacing w:after="240" w:before="240" w:lineRule="auto"/>
-        <w:rPr/>
-      </w:pPr>
-      <w:r>
-        <w:rPr>
-          <w:rtl w:val="0"/>
-        </w:rPr>
-        <w:t xml:space="preserve">The application also provides three filtering options:</w:t>
-      </w:r>
-    </w:p>
-    <w:p>
-      <w:pPr>
-        <w:numPr>
-          <w:ilvl w:val="0"/>
-          <w:numId w:val="4"/>
+        <w:t xml:space="preserve">The application includes a search field that allows users to search for tasks by:</w:t>
+      </w:r>
+    </w:p>
+    <w:p>
+      <w:pPr>
+        <w:numPr>
+          <w:ilvl w:val="0"/>
+          <w:numId w:val="9"/>
         </w:numPr>
         <w:spacing w:after="0" w:afterAutospacing="0" w:before="240" w:lineRule="auto"/>
         <w:ind w:left="720" w:hanging="360"/>
@@ -1638,6 +1632,50 @@
         <w:rPr>
           <w:rtl w:val="0"/>
         </w:rPr>
+        <w:t xml:space="preserve">Task title</w:t>
+      </w:r>
+    </w:p>
+    <w:p>
+      <w:pPr>
+        <w:numPr>
+          <w:ilvl w:val="0"/>
+          <w:numId w:val="9"/>
+        </w:numPr>
+        <w:spacing w:after="240" w:before="0" w:beforeAutospacing="0" w:lineRule="auto"/>
+        <w:ind w:left="720" w:hanging="360"/>
+      </w:pPr>
+      <w:r>
+        <w:rPr>
+          <w:rtl w:val="0"/>
+        </w:rPr>
+        <w:t xml:space="preserve">Task description</w:t>
+      </w:r>
+    </w:p>
+    <w:p>
+      <w:pPr>
+        <w:spacing w:after="240" w:before="240" w:lineRule="auto"/>
+        <w:rPr/>
+      </w:pPr>
+      <w:r>
+        <w:rPr>
+          <w:rtl w:val="0"/>
+        </w:rPr>
+        <w:t xml:space="preserve">Users can also filter tasks using:</w:t>
+      </w:r>
+    </w:p>
+    <w:p>
+      <w:pPr>
+        <w:numPr>
+          <w:ilvl w:val="0"/>
+          <w:numId w:val="2"/>
+        </w:numPr>
+        <w:spacing w:after="0" w:afterAutospacing="0" w:before="240" w:lineRule="auto"/>
+        <w:ind w:left="720" w:hanging="360"/>
+      </w:pPr>
+      <w:r>
+        <w:rPr>
+          <w:rtl w:val="0"/>
+        </w:rPr>
         <w:t xml:space="preserve">All</w:t>
       </w:r>
     </w:p>
@@ -1645,7 +1683,7 @@
       <w:pPr>
         <w:numPr>
           <w:ilvl w:val="0"/>
-          <w:numId w:val="4"/>
+          <w:numId w:val="2"/>
         </w:numPr>
         <w:spacing w:after="0" w:afterAutospacing="0" w:before="0" w:beforeAutospacing="0" w:lineRule="auto"/>
         <w:ind w:left="720" w:hanging="360"/>
@@ -1661,7 +1699,7 @@
       <w:pPr>
         <w:numPr>
           <w:ilvl w:val="0"/>
-          <w:numId w:val="4"/>
+          <w:numId w:val="2"/>
         </w:numPr>
         <w:spacing w:after="240" w:before="0" w:beforeAutospacing="0" w:lineRule="auto"/>
         <w:ind w:left="720" w:hanging="360"/>
@@ -1682,11 +1720,12 @@
         <w:rPr>
           <w:rtl w:val="0"/>
         </w:rPr>
-        <w:t xml:space="preserve">The number of tasks in each category is displayed to the user.</w:t>
-      </w:r>
-    </w:p>
-    <w:p>
-      <w:pPr>
+        <w:t xml:space="preserve">The number of tasks in each category is displayed next to the filter.</w:t>
+      </w:r>
+    </w:p>
+    <w:p>
+      <w:pPr>
+        <w:spacing w:after="240" w:before="240" w:lineRule="auto"/>
         <w:rPr/>
       </w:pPr>
       <w:r>
@@ -1713,7 +1752,7 @@
           <w:szCs w:val="34"/>
         </w:rPr>
       </w:pPr>
-      <w:bookmarkStart w:colFirst="0" w:colLast="0" w:name="_auhehu6pnwn" w:id="20"/>
+      <w:bookmarkStart w:colFirst="0" w:colLast="0" w:name="_ivzcmp2nr6jp" w:id="20"/>
       <w:bookmarkEnd w:id="20"/>
       <w:r>
         <w:rPr>
@@ -1759,23 +1798,24 @@
         <w:rPr>
           <w:rtl w:val="0"/>
         </w:rPr>
-        <w:t xml:space="preserve">SharedPreferences is used to store the selected theme.</w:t>
-      </w:r>
-    </w:p>
-    <w:p>
-      <w:pPr>
-        <w:spacing w:after="240" w:before="240" w:lineRule="auto"/>
-        <w:rPr/>
-      </w:pPr>
-      <w:r>
-        <w:rPr>
-          <w:rtl w:val="0"/>
-        </w:rPr>
-        <w:t xml:space="preserve">Therefore, when the application is closed and reopened, the previously selected theme is automatically restored.</w:t>
-      </w:r>
-    </w:p>
-    <w:p>
-      <w:pPr>
+        <w:t xml:space="preserve">SharedPreferences is used to save the selected theme.</w:t>
+      </w:r>
+    </w:p>
+    <w:p>
+      <w:pPr>
+        <w:spacing w:after="240" w:before="240" w:lineRule="auto"/>
+        <w:rPr/>
+      </w:pPr>
+      <w:r>
+        <w:rPr>
+          <w:rtl w:val="0"/>
+        </w:rPr>
+        <w:t xml:space="preserve">When the application is reopened, the previously selected theme is automatically restored.</w:t>
+      </w:r>
+    </w:p>
+    <w:p>
+      <w:pPr>
+        <w:spacing w:after="240" w:before="240" w:lineRule="auto"/>
         <w:rPr/>
       </w:pPr>
       <w:r>
@@ -1802,7 +1842,7 @@
           <w:szCs w:val="34"/>
         </w:rPr>
       </w:pPr>
-      <w:bookmarkStart w:colFirst="0" w:colLast="0" w:name="_8xeoai78lkwd" w:id="21"/>
+      <w:bookmarkStart w:colFirst="0" w:colLast="0" w:name="_rw4i0vssio6z" w:id="21"/>
       <w:bookmarkEnd w:id="21"/>
       <w:r>
         <w:rPr>
@@ -1812,47 +1852,36 @@
           <w:szCs w:val="34"/>
           <w:rtl w:val="0"/>
         </w:rPr>
-        <w:t xml:space="preserve">10. Responsive UI</w:t>
-      </w:r>
-    </w:p>
-    <w:p>
-      <w:pPr>
-        <w:spacing w:after="240" w:before="240" w:lineRule="auto"/>
-        <w:rPr/>
-      </w:pPr>
-      <w:r>
-        <w:rPr>
-          <w:rtl w:val="0"/>
-        </w:rPr>
-        <w:t xml:space="preserve">The application uses Flutter's responsive layout capabilities to provide a suitable interface for different screen sizes.</w:t>
-      </w:r>
-    </w:p>
-    <w:p>
-      <w:pPr>
-        <w:spacing w:after="240" w:before="240" w:lineRule="auto"/>
-        <w:rPr/>
-      </w:pPr>
-      <w:r>
-        <w:rPr>
-          <w:rtl w:val="0"/>
-        </w:rPr>
-        <w:t xml:space="preserve">The layout adjusts its horizontal spacing and components depending on the available screen width.</w:t>
-      </w:r>
-    </w:p>
-    <w:p>
-      <w:pPr>
-        <w:spacing w:after="240" w:before="240" w:lineRule="auto"/>
-        <w:rPr/>
-      </w:pPr>
-      <w:r>
-        <w:rPr>
-          <w:rtl w:val="0"/>
-        </w:rPr>
-        <w:t xml:space="preserve">This allows the application to work on mobile devices and larger screens.</w:t>
-      </w:r>
-    </w:p>
-    <w:p>
-      <w:pPr>
+        <w:t xml:space="preserve">10. Responsive Design</w:t>
+      </w:r>
+    </w:p>
+    <w:p>
+      <w:pPr>
+        <w:spacing w:after="240" w:before="240" w:lineRule="auto"/>
+        <w:rPr/>
+      </w:pPr>
+      <w:r>
+        <w:rPr>
+          <w:rtl w:val="0"/>
+        </w:rPr>
+        <w:t xml:space="preserve">The application uses Flutter's responsive layout capabilities to adapt the interface to different screen sizes.</w:t>
+      </w:r>
+    </w:p>
+    <w:p>
+      <w:pPr>
+        <w:spacing w:after="240" w:before="240" w:lineRule="auto"/>
+        <w:rPr/>
+      </w:pPr>
+      <w:r>
+        <w:rPr>
+          <w:rtl w:val="0"/>
+        </w:rPr>
+        <w:t xml:space="preserve">Spacing and layout components adjust according to the available screen width, providing a suitable experience on mobile devices and larger screens.</w:t>
+      </w:r>
+    </w:p>
+    <w:p>
+      <w:pPr>
+        <w:spacing w:after="240" w:before="240" w:lineRule="auto"/>
         <w:rPr/>
       </w:pPr>
       <w:r>
@@ -1879,7 +1908,7 @@
           <w:szCs w:val="34"/>
         </w:rPr>
       </w:pPr>
-      <w:bookmarkStart w:colFirst="0" w:colLast="0" w:name="_8uzojv8xg40b" w:id="22"/>
+      <w:bookmarkStart w:colFirst="0" w:colLast="0" w:name="_yfogxrxn7x09" w:id="22"/>
       <w:bookmarkEnd w:id="22"/>
       <w:r>
         <w:rPr>
@@ -1889,44 +1918,32 @@
           <w:szCs w:val="34"/>
           <w:rtl w:val="0"/>
         </w:rPr>
-        <w:t xml:space="preserve">11. User Interface</w:t>
-      </w:r>
-    </w:p>
-    <w:p>
-      <w:pPr>
-        <w:spacing w:after="240" w:before="240" w:lineRule="auto"/>
-        <w:rPr/>
-      </w:pPr>
-      <w:r>
-        <w:rPr>
-          <w:rtl w:val="0"/>
-        </w:rPr>
-        <w:t xml:space="preserve">The application contains the following main screens and components:</w:t>
-      </w:r>
-    </w:p>
-    <w:p>
-      <w:pPr>
-        <w:pStyle w:val="Heading3"/>
-        <w:keepNext w:val="0"/>
-        <w:keepLines w:val="0"/>
-        <w:spacing w:before="280" w:lineRule="auto"/>
-        <w:rPr>
-          <w:b w:val="1"/>
-          <w:bCs w:val="1"/>
-          <w:color w:val="000000"/>
-          <w:sz w:val="26"/>
-          <w:szCs w:val="26"/>
-        </w:rPr>
-      </w:pPr>
-      <w:bookmarkStart w:colFirst="0" w:colLast="0" w:name="_9tiznuw1dsvd" w:id="23"/>
-      <w:bookmarkEnd w:id="23"/>
-      <w:r>
-        <w:rPr>
-          <w:b w:val="1"/>
-          <w:bCs w:val="1"/>
-          <w:color w:val="000000"/>
-          <w:sz w:val="26"/>
-          <w:szCs w:val="26"/>
+        <w:t xml:space="preserve">11. Application Screens</w:t>
+      </w:r>
+    </w:p>
+    <w:p>
+      <w:pPr>
+        <w:spacing w:after="240" w:before="240" w:lineRule="auto"/>
+        <w:rPr/>
+      </w:pPr>
+      <w:r>
+        <w:rPr>
+          <w:rtl w:val="0"/>
+        </w:rPr>
+        <w:t xml:space="preserve">The project includes:</w:t>
+      </w:r>
+    </w:p>
+    <w:p>
+      <w:pPr>
+        <w:numPr>
+          <w:ilvl w:val="0"/>
+          <w:numId w:val="8"/>
+        </w:numPr>
+        <w:spacing w:after="0" w:afterAutospacing="0" w:before="240" w:lineRule="auto"/>
+        <w:ind w:left="720" w:hanging="360"/>
+      </w:pPr>
+      <w:r>
+        <w:rPr>
           <w:rtl w:val="0"/>
         </w:rPr>
         <w:t xml:space="preserve">Home Screen</w:t>
@@ -1934,37 +1951,9 @@
     </w:p>
     <w:p>
       <w:pPr>
-        <w:spacing w:after="240" w:before="240" w:lineRule="auto"/>
-        <w:rPr/>
-      </w:pPr>
-      <w:r>
-        <w:rPr>
-          <w:rtl w:val="0"/>
-        </w:rPr>
-        <w:t xml:space="preserve">The Home Screen displays:</w:t>
-      </w:r>
-    </w:p>
-    <w:p>
-      <w:pPr>
-        <w:numPr>
-          <w:ilvl w:val="0"/>
-          <w:numId w:val="3"/>
-        </w:numPr>
-        <w:spacing w:after="0" w:afterAutospacing="0" w:before="240" w:lineRule="auto"/>
-        <w:ind w:left="720" w:hanging="360"/>
-      </w:pPr>
-      <w:r>
-        <w:rPr>
-          <w:rtl w:val="0"/>
-        </w:rPr>
-        <w:t xml:space="preserve">Total number of tasks</w:t>
-      </w:r>
-    </w:p>
-    <w:p>
-      <w:pPr>
-        <w:numPr>
-          <w:ilvl w:val="0"/>
-          <w:numId w:val="3"/>
+        <w:numPr>
+          <w:ilvl w:val="0"/>
+          <w:numId w:val="8"/>
         </w:numPr>
         <w:spacing w:after="0" w:afterAutospacing="0" w:before="0" w:beforeAutospacing="0" w:lineRule="auto"/>
         <w:ind w:left="720" w:hanging="360"/>
@@ -1973,14 +1962,14 @@
         <w:rPr>
           <w:rtl w:val="0"/>
         </w:rPr>
-        <w:t xml:space="preserve">Number of completed tasks</w:t>
-      </w:r>
-    </w:p>
-    <w:p>
-      <w:pPr>
-        <w:numPr>
-          <w:ilvl w:val="0"/>
-          <w:numId w:val="3"/>
+        <w:t xml:space="preserve">Add Task Screen</w:t>
+      </w:r>
+    </w:p>
+    <w:p>
+      <w:pPr>
+        <w:numPr>
+          <w:ilvl w:val="0"/>
+          <w:numId w:val="8"/>
         </w:numPr>
         <w:spacing w:after="0" w:afterAutospacing="0" w:before="0" w:beforeAutospacing="0" w:lineRule="auto"/>
         <w:ind w:left="720" w:hanging="360"/>
@@ -1989,14 +1978,14 @@
         <w:rPr>
           <w:rtl w:val="0"/>
         </w:rPr>
-        <w:t xml:space="preserve">Search bar</w:t>
-      </w:r>
-    </w:p>
-    <w:p>
-      <w:pPr>
-        <w:numPr>
-          <w:ilvl w:val="0"/>
-          <w:numId w:val="3"/>
+        <w:t xml:space="preserve">Edit Task</w:t>
+      </w:r>
+    </w:p>
+    <w:p>
+      <w:pPr>
+        <w:numPr>
+          <w:ilvl w:val="0"/>
+          <w:numId w:val="8"/>
         </w:numPr>
         <w:spacing w:after="0" w:afterAutospacing="0" w:before="0" w:beforeAutospacing="0" w:lineRule="auto"/>
         <w:ind w:left="720" w:hanging="360"/>
@@ -2005,14 +1994,14 @@
         <w:rPr>
           <w:rtl w:val="0"/>
         </w:rPr>
-        <w:t xml:space="preserve">Task filters</w:t>
-      </w:r>
-    </w:p>
-    <w:p>
-      <w:pPr>
-        <w:numPr>
-          <w:ilvl w:val="0"/>
-          <w:numId w:val="3"/>
+        <w:t xml:space="preserve">Search</w:t>
+      </w:r>
+    </w:p>
+    <w:p>
+      <w:pPr>
+        <w:numPr>
+          <w:ilvl w:val="0"/>
+          <w:numId w:val="8"/>
         </w:numPr>
         <w:spacing w:after="0" w:afterAutospacing="0" w:before="0" w:beforeAutospacing="0" w:lineRule="auto"/>
         <w:ind w:left="720" w:hanging="360"/>
@@ -2021,14 +2010,14 @@
         <w:rPr>
           <w:rtl w:val="0"/>
         </w:rPr>
-        <w:t xml:space="preserve">Task list</w:t>
-      </w:r>
-    </w:p>
-    <w:p>
-      <w:pPr>
-        <w:numPr>
-          <w:ilvl w:val="0"/>
-          <w:numId w:val="3"/>
+        <w:t xml:space="preserve">Task Filters</w:t>
+      </w:r>
+    </w:p>
+    <w:p>
+      <w:pPr>
+        <w:numPr>
+          <w:ilvl w:val="0"/>
+          <w:numId w:val="8"/>
         </w:numPr>
         <w:spacing w:after="0" w:afterAutospacing="0" w:before="0" w:beforeAutospacing="0" w:lineRule="auto"/>
         <w:ind w:left="720" w:hanging="360"/>
@@ -2037,14 +2026,30 @@
         <w:rPr>
           <w:rtl w:val="0"/>
         </w:rPr>
-        <w:t xml:space="preserve">Add Task button</w:t>
-      </w:r>
-    </w:p>
-    <w:p>
-      <w:pPr>
-        <w:numPr>
-          <w:ilvl w:val="0"/>
-          <w:numId w:val="3"/>
+        <w:t xml:space="preserve">Delete Confirmation</w:t>
+      </w:r>
+    </w:p>
+    <w:p>
+      <w:pPr>
+        <w:numPr>
+          <w:ilvl w:val="0"/>
+          <w:numId w:val="8"/>
+        </w:numPr>
+        <w:spacing w:after="0" w:afterAutospacing="0" w:before="0" w:beforeAutospacing="0" w:lineRule="auto"/>
+        <w:ind w:left="720" w:hanging="360"/>
+      </w:pPr>
+      <w:r>
+        <w:rPr>
+          <w:rtl w:val="0"/>
+        </w:rPr>
+        <w:t xml:space="preserve">Light Mode</w:t>
+      </w:r>
+    </w:p>
+    <w:p>
+      <w:pPr>
+        <w:numPr>
+          <w:ilvl w:val="0"/>
+          <w:numId w:val="8"/>
         </w:numPr>
         <w:spacing w:after="240" w:before="0" w:beforeAutospacing="0" w:lineRule="auto"/>
         <w:ind w:left="720" w:hanging="360"/>
@@ -2053,131 +2058,12 @@
         <w:rPr>
           <w:rtl w:val="0"/>
         </w:rPr>
-        <w:t xml:space="preserve">Theme switch button</w:t>
-      </w:r>
-    </w:p>
-    <w:p>
-      <w:pPr>
-        <w:pStyle w:val="Heading3"/>
-        <w:keepNext w:val="0"/>
-        <w:keepLines w:val="0"/>
-        <w:spacing w:before="280" w:lineRule="auto"/>
-        <w:rPr>
-          <w:b w:val="1"/>
-          <w:bCs w:val="1"/>
-          <w:color w:val="000000"/>
-          <w:sz w:val="26"/>
-          <w:szCs w:val="26"/>
-        </w:rPr>
-      </w:pPr>
-      <w:bookmarkStart w:colFirst="0" w:colLast="0" w:name="_3vftkmnm3ruj" w:id="24"/>
-      <w:bookmarkEnd w:id="24"/>
-      <w:r>
-        <w:rPr>
-          <w:b w:val="1"/>
-          <w:bCs w:val="1"/>
-          <w:color w:val="000000"/>
-          <w:sz w:val="26"/>
-          <w:szCs w:val="26"/>
-          <w:rtl w:val="0"/>
-        </w:rPr>
-        <w:t xml:space="preserve">Add Task Screen</w:t>
-      </w:r>
-    </w:p>
-    <w:p>
-      <w:pPr>
-        <w:spacing w:after="240" w:before="240" w:lineRule="auto"/>
-        <w:rPr/>
-      </w:pPr>
-      <w:r>
-        <w:rPr>
-          <w:rtl w:val="0"/>
-        </w:rPr>
-        <w:t xml:space="preserve">Users can enter task information and select a due date.</w:t>
-      </w:r>
-    </w:p>
-    <w:p>
-      <w:pPr>
-        <w:pStyle w:val="Heading3"/>
-        <w:keepNext w:val="0"/>
-        <w:keepLines w:val="0"/>
-        <w:spacing w:before="280" w:lineRule="auto"/>
-        <w:rPr>
-          <w:b w:val="1"/>
-          <w:bCs w:val="1"/>
-          <w:color w:val="000000"/>
-          <w:sz w:val="26"/>
-          <w:szCs w:val="26"/>
-        </w:rPr>
-      </w:pPr>
-      <w:bookmarkStart w:colFirst="0" w:colLast="0" w:name="_2zez4fce3o6i" w:id="25"/>
-      <w:bookmarkEnd w:id="25"/>
-      <w:r>
-        <w:rPr>
-          <w:b w:val="1"/>
-          <w:bCs w:val="1"/>
-          <w:color w:val="000000"/>
-          <w:sz w:val="26"/>
-          <w:szCs w:val="26"/>
-          <w:rtl w:val="0"/>
-        </w:rPr>
-        <w:t xml:space="preserve">Edit Task</w:t>
-      </w:r>
-    </w:p>
-    <w:p>
-      <w:pPr>
-        <w:spacing w:after="240" w:before="240" w:lineRule="auto"/>
-        <w:rPr/>
-      </w:pPr>
-      <w:r>
-        <w:rPr>
-          <w:rtl w:val="0"/>
-        </w:rPr>
-        <w:t xml:space="preserve">The same form is used to edit existing task information.</w:t>
-      </w:r>
-    </w:p>
-    <w:p>
-      <w:pPr>
-        <w:pStyle w:val="Heading3"/>
-        <w:keepNext w:val="0"/>
-        <w:keepLines w:val="0"/>
-        <w:spacing w:before="280" w:lineRule="auto"/>
-        <w:rPr>
-          <w:b w:val="1"/>
-          <w:bCs w:val="1"/>
-          <w:color w:val="000000"/>
-          <w:sz w:val="26"/>
-          <w:szCs w:val="26"/>
-        </w:rPr>
-      </w:pPr>
-      <w:bookmarkStart w:colFirst="0" w:colLast="0" w:name="_9fugtn6s6hpb" w:id="26"/>
-      <w:bookmarkEnd w:id="26"/>
-      <w:r>
-        <w:rPr>
-          <w:b w:val="1"/>
-          <w:bCs w:val="1"/>
-          <w:color w:val="000000"/>
-          <w:sz w:val="26"/>
-          <w:szCs w:val="26"/>
-          <w:rtl w:val="0"/>
-        </w:rPr>
-        <w:t xml:space="preserve">Delete Confirmation</w:t>
-      </w:r>
-    </w:p>
-    <w:p>
-      <w:pPr>
-        <w:spacing w:after="240" w:before="240" w:lineRule="auto"/>
-        <w:rPr/>
-      </w:pPr>
-      <w:r>
-        <w:rPr>
-          <w:rtl w:val="0"/>
-        </w:rPr>
-        <w:t xml:space="preserve">A confirmation dialog is displayed before deleting a task.</w:t>
-      </w:r>
-    </w:p>
-    <w:p>
-      <w:pPr>
+        <w:t xml:space="preserve">Dark Mode</w:t>
+      </w:r>
+    </w:p>
+    <w:p>
+      <w:pPr>
+        <w:spacing w:after="240" w:before="240" w:lineRule="auto"/>
         <w:rPr/>
       </w:pPr>
       <w:r>
@@ -2204,8 +2090,8 @@
           <w:szCs w:val="34"/>
         </w:rPr>
       </w:pPr>
-      <w:bookmarkStart w:colFirst="0" w:colLast="0" w:name="_28w3dja6fs9u" w:id="27"/>
-      <w:bookmarkEnd w:id="27"/>
+      <w:bookmarkStart w:colFirst="0" w:colLast="0" w:name="_vwzzuxaubx9" w:id="23"/>
+      <w:bookmarkEnd w:id="23"/>
       <w:r>
         <w:rPr>
           <w:b w:val="1"/>
@@ -2215,18 +2101,6 @@
           <w:rtl w:val="0"/>
         </w:rPr>
         <w:t xml:space="preserve">12. Testing</w:t>
-      </w:r>
-    </w:p>
-    <w:p>
-      <w:pPr>
-        <w:spacing w:after="240" w:before="240" w:lineRule="auto"/>
-        <w:rPr/>
-      </w:pPr>
-      <w:r>
-        <w:rPr>
-          <w:rtl w:val="0"/>
-        </w:rPr>
-        <w:t xml:space="preserve">The following operations were tested successfully:</w:t>
       </w:r>
     </w:p>
     <w:tbl>
@@ -2279,6 +2153,7 @@
           </w:tcPr>
           <w:p>
             <w:pPr>
+              <w:spacing w:after="240" w:before="240" w:lineRule="auto"/>
               <w:jc w:val="center"/>
               <w:rPr/>
             </w:pPr>
@@ -2288,7 +2163,7 @@
                 <w:bCs w:val="1"/>
                 <w:rtl w:val="0"/>
               </w:rPr>
-              <w:t xml:space="preserve">Test</w:t>
+              <w:t xml:space="preserve">Test Case</w:t>
             </w:r>
             <w:r>
               <w:rPr>
@@ -2315,6 +2190,7 @@
           </w:tcPr>
           <w:p>
             <w:pPr>
+              <w:spacing w:after="240" w:before="240" w:lineRule="auto"/>
               <w:jc w:val="center"/>
               <w:rPr/>
             </w:pPr>
@@ -2358,13 +2234,14 @@
           </w:tcPr>
           <w:p>
             <w:pPr>
+              <w:spacing w:after="240" w:before="240" w:lineRule="auto"/>
               <w:rPr/>
             </w:pPr>
             <w:r>
               <w:rPr>
                 <w:rtl w:val="0"/>
               </w:rPr>
-              <w:t xml:space="preserve">Add Task</w:t>
+              <w:t xml:space="preserve">Create Task</w:t>
             </w:r>
           </w:p>
         </w:tc>
@@ -2386,13 +2263,14 @@
           </w:tcPr>
           <w:p>
             <w:pPr>
+              <w:spacing w:after="240" w:before="240" w:lineRule="auto"/>
               <w:rPr/>
             </w:pPr>
             <w:r>
               <w:rPr>
                 <w:rtl w:val="0"/>
               </w:rPr>
-              <w:t xml:space="preserve">Passed</w:t>
+              <w:t xml:space="preserve">Passd</w:t>
             </w:r>
           </w:p>
         </w:tc>
@@ -2421,13 +2299,14 @@
           </w:tcPr>
           <w:p>
             <w:pPr>
+              <w:spacing w:after="240" w:before="240" w:lineRule="auto"/>
               <w:rPr/>
             </w:pPr>
             <w:r>
               <w:rPr>
                 <w:rtl w:val="0"/>
               </w:rPr>
-              <w:t xml:space="preserve">Display Tasks</w:t>
+              <w:t xml:space="preserve">View Tasks</w:t>
             </w:r>
           </w:p>
         </w:tc>
@@ -2449,13 +2328,14 @@
           </w:tcPr>
           <w:p>
             <w:pPr>
+              <w:spacing w:after="240" w:before="240" w:lineRule="auto"/>
               <w:rPr/>
             </w:pPr>
             <w:r>
               <w:rPr>
                 <w:rtl w:val="0"/>
               </w:rPr>
-              <w:t xml:space="preserve">Passed</w:t>
+              <w:t xml:space="preserve">Passd</w:t>
             </w:r>
           </w:p>
         </w:tc>
@@ -2484,6 +2364,7 @@
           </w:tcPr>
           <w:p>
             <w:pPr>
+              <w:spacing w:after="240" w:before="240" w:lineRule="auto"/>
               <w:rPr/>
             </w:pPr>
             <w:r>
@@ -2512,13 +2393,14 @@
           </w:tcPr>
           <w:p>
             <w:pPr>
+              <w:spacing w:after="240" w:before="240" w:lineRule="auto"/>
               <w:rPr/>
             </w:pPr>
             <w:r>
               <w:rPr>
                 <w:rtl w:val="0"/>
               </w:rPr>
-              <w:t xml:space="preserve">Passed</w:t>
+              <w:t xml:space="preserve">Passd</w:t>
             </w:r>
           </w:p>
         </w:tc>
@@ -2547,6 +2429,7 @@
           </w:tcPr>
           <w:p>
             <w:pPr>
+              <w:spacing w:after="240" w:before="240" w:lineRule="auto"/>
               <w:rPr/>
             </w:pPr>
             <w:r>
@@ -2575,13 +2458,14 @@
           </w:tcPr>
           <w:p>
             <w:pPr>
+              <w:spacing w:after="240" w:before="240" w:lineRule="auto"/>
               <w:rPr/>
             </w:pPr>
             <w:r>
               <w:rPr>
                 <w:rtl w:val="0"/>
               </w:rPr>
-              <w:t xml:space="preserve">Passed</w:t>
+              <w:t xml:space="preserve">Passd</w:t>
             </w:r>
           </w:p>
         </w:tc>
@@ -2610,6 +2494,7 @@
           </w:tcPr>
           <w:p>
             <w:pPr>
+              <w:spacing w:after="240" w:before="240" w:lineRule="auto"/>
               <w:rPr/>
             </w:pPr>
             <w:r>
@@ -2638,13 +2523,14 @@
           </w:tcPr>
           <w:p>
             <w:pPr>
+              <w:spacing w:after="240" w:before="240" w:lineRule="auto"/>
               <w:rPr/>
             </w:pPr>
             <w:r>
               <w:rPr>
                 <w:rtl w:val="0"/>
               </w:rPr>
-              <w:t xml:space="preserve">Passed</w:t>
+              <w:t xml:space="preserve">Passd</w:t>
             </w:r>
           </w:p>
         </w:tc>
@@ -2673,6 +2559,7 @@
           </w:tcPr>
           <w:p>
             <w:pPr>
+              <w:spacing w:after="240" w:before="240" w:lineRule="auto"/>
               <w:rPr/>
             </w:pPr>
             <w:r>
@@ -2701,13 +2588,14 @@
           </w:tcPr>
           <w:p>
             <w:pPr>
+              <w:spacing w:after="240" w:before="240" w:lineRule="auto"/>
               <w:rPr/>
             </w:pPr>
             <w:r>
               <w:rPr>
                 <w:rtl w:val="0"/>
               </w:rPr>
-              <w:t xml:space="preserve">Passed</w:t>
+              <w:t xml:space="preserve">Passd</w:t>
             </w:r>
           </w:p>
         </w:tc>
@@ -2736,6 +2624,7 @@
           </w:tcPr>
           <w:p>
             <w:pPr>
+              <w:spacing w:after="240" w:before="240" w:lineRule="auto"/>
               <w:rPr/>
             </w:pPr>
             <w:r>
@@ -2764,13 +2653,14 @@
           </w:tcPr>
           <w:p>
             <w:pPr>
+              <w:spacing w:after="240" w:before="240" w:lineRule="auto"/>
               <w:rPr/>
             </w:pPr>
             <w:r>
               <w:rPr>
                 <w:rtl w:val="0"/>
               </w:rPr>
-              <w:t xml:space="preserve">Passed</w:t>
+              <w:t xml:space="preserve">Passd</w:t>
             </w:r>
           </w:p>
         </w:tc>
@@ -2799,6 +2689,7 @@
           </w:tcPr>
           <w:p>
             <w:pPr>
+              <w:spacing w:after="240" w:before="240" w:lineRule="auto"/>
               <w:rPr/>
             </w:pPr>
             <w:r>
@@ -2827,13 +2718,14 @@
           </w:tcPr>
           <w:p>
             <w:pPr>
+              <w:spacing w:after="240" w:before="240" w:lineRule="auto"/>
               <w:rPr/>
             </w:pPr>
             <w:r>
               <w:rPr>
                 <w:rtl w:val="0"/>
               </w:rPr>
-              <w:t xml:space="preserve">Passed</w:t>
+              <w:t xml:space="preserve">Passd</w:t>
             </w:r>
           </w:p>
         </w:tc>
@@ -2862,6 +2754,7 @@
           </w:tcPr>
           <w:p>
             <w:pPr>
+              <w:spacing w:after="240" w:before="240" w:lineRule="auto"/>
               <w:rPr/>
             </w:pPr>
             <w:r>
@@ -2890,13 +2783,14 @@
           </w:tcPr>
           <w:p>
             <w:pPr>
+              <w:spacing w:after="240" w:before="240" w:lineRule="auto"/>
               <w:rPr/>
             </w:pPr>
             <w:r>
               <w:rPr>
                 <w:rtl w:val="0"/>
               </w:rPr>
-              <w:t xml:space="preserve">Passed</w:t>
+              <w:t xml:space="preserve">Passd</w:t>
             </w:r>
           </w:p>
         </w:tc>
@@ -2925,6 +2819,7 @@
           </w:tcPr>
           <w:p>
             <w:pPr>
+              <w:spacing w:after="240" w:before="240" w:lineRule="auto"/>
               <w:rPr/>
             </w:pPr>
             <w:r>
@@ -2953,13 +2848,14 @@
           </w:tcPr>
           <w:p>
             <w:pPr>
+              <w:spacing w:after="240" w:before="240" w:lineRule="auto"/>
               <w:rPr/>
             </w:pPr>
             <w:r>
               <w:rPr>
                 <w:rtl w:val="0"/>
               </w:rPr>
-              <w:t xml:space="preserve">Passed</w:t>
+              <w:t xml:space="preserve">Passd</w:t>
             </w:r>
           </w:p>
         </w:tc>
@@ -2988,6 +2884,7 @@
           </w:tcPr>
           <w:p>
             <w:pPr>
+              <w:spacing w:after="240" w:before="240" w:lineRule="auto"/>
               <w:rPr/>
             </w:pPr>
             <w:r>
@@ -3016,13 +2913,14 @@
           </w:tcPr>
           <w:p>
             <w:pPr>
+              <w:spacing w:after="240" w:before="240" w:lineRule="auto"/>
               <w:rPr/>
             </w:pPr>
             <w:r>
               <w:rPr>
                 <w:rtl w:val="0"/>
               </w:rPr>
-              <w:t xml:space="preserve">Passed</w:t>
+              <w:t xml:space="preserve">Passd</w:t>
             </w:r>
           </w:p>
         </w:tc>
@@ -3051,6 +2949,7 @@
           </w:tcPr>
           <w:p>
             <w:pPr>
+              <w:spacing w:after="240" w:before="240" w:lineRule="auto"/>
               <w:rPr/>
             </w:pPr>
             <w:r>
@@ -3079,13 +2978,14 @@
           </w:tcPr>
           <w:p>
             <w:pPr>
+              <w:spacing w:after="240" w:before="240" w:lineRule="auto"/>
               <w:rPr/>
             </w:pPr>
             <w:r>
               <w:rPr>
                 <w:rtl w:val="0"/>
               </w:rPr>
-              <w:t xml:space="preserve">Passed</w:t>
+              <w:t xml:space="preserve">Passd</w:t>
             </w:r>
           </w:p>
         </w:tc>
@@ -3114,6 +3014,7 @@
           </w:tcPr>
           <w:p>
             <w:pPr>
+              <w:spacing w:after="240" w:before="240" w:lineRule="auto"/>
               <w:rPr/>
             </w:pPr>
             <w:r>
@@ -3142,13 +3043,14 @@
           </w:tcPr>
           <w:p>
             <w:pPr>
+              <w:spacing w:after="240" w:before="240" w:lineRule="auto"/>
               <w:rPr/>
             </w:pPr>
             <w:r>
               <w:rPr>
                 <w:rtl w:val="0"/>
               </w:rPr>
-              <w:t xml:space="preserve">Passed</w:t>
+              <w:t xml:space="preserve">Passd</w:t>
             </w:r>
           </w:p>
         </w:tc>
@@ -3156,6 +3058,7 @@
     </w:tbl>
     <w:p>
       <w:pPr>
+        <w:spacing w:after="240" w:before="240" w:lineRule="auto"/>
         <w:rPr/>
       </w:pPr>
       <w:r>
@@ -3182,8 +3085,8 @@
           <w:szCs w:val="34"/>
         </w:rPr>
       </w:pPr>
-      <w:bookmarkStart w:colFirst="0" w:colLast="0" w:name="_91cqxp2pgtd9" w:id="28"/>
-      <w:bookmarkEnd w:id="28"/>
+      <w:bookmarkStart w:colFirst="0" w:colLast="0" w:name="_uei1gj8d2q3" w:id="24"/>
+      <w:bookmarkEnd w:id="24"/>
       <w:r>
         <w:rPr>
           <w:b w:val="1"/>
@@ -3192,147 +3095,69 @@
           <w:szCs w:val="34"/>
           <w:rtl w:val="0"/>
         </w:rPr>
-        <w:t xml:space="preserve">13. Challenges</w:t>
-      </w:r>
-    </w:p>
-    <w:p>
-      <w:pPr>
-        <w:spacing w:after="240" w:before="240" w:lineRule="auto"/>
-        <w:rPr/>
-      </w:pPr>
-      <w:r>
-        <w:rPr>
-          <w:rtl w:val="0"/>
-        </w:rPr>
-        <w:t xml:space="preserve">During the development of the application, several challenges were addressed, including:</w:t>
-      </w:r>
-    </w:p>
-    <w:p>
-      <w:pPr>
-        <w:numPr>
-          <w:ilvl w:val="0"/>
-          <w:numId w:val="1"/>
-        </w:numPr>
-        <w:spacing w:after="0" w:afterAutospacing="0" w:before="240" w:lineRule="auto"/>
-        <w:ind w:left="720" w:hanging="360"/>
-      </w:pPr>
-      <w:r>
-        <w:rPr>
-          <w:rtl w:val="0"/>
-        </w:rPr>
-        <w:t xml:space="preserve">Connecting the UI with local Hive storage.</w:t>
-      </w:r>
-    </w:p>
-    <w:p>
-      <w:pPr>
-        <w:numPr>
-          <w:ilvl w:val="0"/>
-          <w:numId w:val="1"/>
-        </w:numPr>
-        <w:spacing w:after="0" w:afterAutospacing="0" w:before="0" w:beforeAutospacing="0" w:lineRule="auto"/>
-        <w:ind w:left="720" w:hanging="360"/>
-      </w:pPr>
-      <w:r>
-        <w:rPr>
-          <w:rtl w:val="0"/>
-        </w:rPr>
-        <w:t xml:space="preserve">Managing task state using Cubit.</w:t>
-      </w:r>
-    </w:p>
-    <w:p>
-      <w:pPr>
-        <w:numPr>
-          <w:ilvl w:val="0"/>
-          <w:numId w:val="1"/>
-        </w:numPr>
-        <w:spacing w:after="0" w:afterAutospacing="0" w:before="0" w:beforeAutospacing="0" w:lineRule="auto"/>
-        <w:ind w:left="720" w:hanging="360"/>
-      </w:pPr>
-      <w:r>
-        <w:rPr>
-          <w:rtl w:val="0"/>
-        </w:rPr>
-        <w:t xml:space="preserve">Implementing CRUD operations.</w:t>
-      </w:r>
-    </w:p>
-    <w:p>
-      <w:pPr>
-        <w:numPr>
-          <w:ilvl w:val="0"/>
-          <w:numId w:val="1"/>
-        </w:numPr>
-        <w:spacing w:after="0" w:afterAutospacing="0" w:before="0" w:beforeAutospacing="0" w:lineRule="auto"/>
-        <w:ind w:left="720" w:hanging="360"/>
-      </w:pPr>
-      <w:r>
-        <w:rPr>
-          <w:rtl w:val="0"/>
-        </w:rPr>
-        <w:t xml:space="preserve">Updating the UI automatically after database changes.</w:t>
-      </w:r>
-    </w:p>
-    <w:p>
-      <w:pPr>
-        <w:numPr>
-          <w:ilvl w:val="0"/>
-          <w:numId w:val="1"/>
-        </w:numPr>
-        <w:spacing w:after="0" w:afterAutospacing="0" w:before="0" w:beforeAutospacing="0" w:lineRule="auto"/>
-        <w:ind w:left="720" w:hanging="360"/>
-      </w:pPr>
-      <w:r>
-        <w:rPr>
-          <w:rtl w:val="0"/>
-        </w:rPr>
-        <w:t xml:space="preserve">Maintaining task data after restarting the application.</w:t>
-      </w:r>
-    </w:p>
-    <w:p>
-      <w:pPr>
-        <w:numPr>
-          <w:ilvl w:val="0"/>
-          <w:numId w:val="1"/>
-        </w:numPr>
-        <w:spacing w:after="0" w:afterAutospacing="0" w:before="0" w:beforeAutospacing="0" w:lineRule="auto"/>
-        <w:ind w:left="720" w:hanging="360"/>
-      </w:pPr>
-      <w:r>
-        <w:rPr>
-          <w:rtl w:val="0"/>
-        </w:rPr>
-        <w:t xml:space="preserve">Implementing persistent Light/Dark Mode.</w:t>
-      </w:r>
-    </w:p>
-    <w:p>
-      <w:pPr>
-        <w:numPr>
-          <w:ilvl w:val="0"/>
-          <w:numId w:val="1"/>
-        </w:numPr>
-        <w:spacing w:after="240" w:before="0" w:beforeAutospacing="0" w:lineRule="auto"/>
-        <w:ind w:left="720" w:hanging="360"/>
-      </w:pPr>
-      <w:r>
-        <w:rPr>
-          <w:rtl w:val="0"/>
-        </w:rPr>
-        <w:t xml:space="preserve">Creating a responsive layout for different screen sizes.</w:t>
-      </w:r>
-    </w:p>
-    <w:p>
-      <w:pPr>
-        <w:spacing w:after="240" w:before="240" w:lineRule="auto"/>
-        <w:rPr/>
-      </w:pPr>
-      <w:r>
-        <w:rPr>
-          <w:rtl w:val="0"/>
-        </w:rPr>
-        <w:t xml:space="preserve">These challenges helped improve my understanding of Flutter application architecture, local storage, and state management.</w:t>
-      </w:r>
-    </w:p>
-    <w:p>
-      <w:pPr>
+        <w:t xml:space="preserve">13. Project Repository</w:t>
+      </w:r>
+    </w:p>
+    <w:p>
+      <w:pPr>
+        <w:spacing w:after="240" w:before="240" w:lineRule="auto"/>
+        <w:rPr/>
+      </w:pPr>
+      <w:r>
+        <w:rPr>
+          <w:rtl w:val="0"/>
+        </w:rPr>
+        <w:t xml:space="preserve">The complete source code is publicly available on GitHub:</w:t>
+      </w:r>
+    </w:p>
+    <w:p>
+      <w:pPr>
+        <w:spacing w:after="240" w:before="240" w:lineRule="auto"/>
+        <w:rPr>
+          <w:color w:val="1155cc"/>
+          <w:u w:val="single"/>
+        </w:rPr>
+      </w:pPr>
+      <w:r>
+        <w:rPr>
+          <w:b w:val="1"/>
+          <w:bCs w:val="1"/>
+          <w:rtl w:val="0"/>
+        </w:rPr>
+        <w:t xml:space="preserve">GitHub Repository:</w:t>
+        <w:br w:type="textWrapping"/>
+      </w:r>
+      <w:hyperlink r:id="rId6">
+        <w:r>
+          <w:rPr>
+            <w:color w:val="1155cc"/>
+            <w:u w:val="single"/>
+            <w:rtl w:val="0"/>
+          </w:rPr>
+          <w:t xml:space="preserve">https://github.com/nouranagiy/task-manager-flutter</w:t>
+        </w:r>
+      </w:hyperlink>
+      <w:r>
+        <w:rPr>
+          <w:rtl w:val="0"/>
+        </w:rPr>
+      </w:r>
+    </w:p>
+    <w:p>
+      <w:pPr>
+        <w:spacing w:after="240" w:before="240" w:lineRule="auto"/>
+        <w:rPr/>
+      </w:pPr>
+      <w:r>
+        <w:rPr>
+          <w:rtl w:val="0"/>
+        </w:rPr>
+        <w:t xml:space="preserve">The repository contains the Flutter source code, project structure, README documentation, and application screenshots.</w:t>
+      </w:r>
+    </w:p>
+    <w:p>
+      <w:pPr>
+        <w:spacing w:after="240" w:before="240" w:lineRule="auto"/>
         <w:rPr/>
       </w:pPr>
       <w:r>
@@ -3359,8 +3184,8 @@
           <w:szCs w:val="34"/>
         </w:rPr>
       </w:pPr>
-      <w:bookmarkStart w:colFirst="0" w:colLast="0" w:name="_yd5pxjxps8l5" w:id="29"/>
-      <w:bookmarkEnd w:id="29"/>
+      <w:bookmarkStart w:colFirst="0" w:colLast="0" w:name="_x9h37f8a7l3z" w:id="25"/>
+      <w:bookmarkEnd w:id="25"/>
       <w:r>
         <w:rPr>
           <w:b w:val="1"/>
@@ -3369,54 +3194,529 @@
           <w:szCs w:val="34"/>
           <w:rtl w:val="0"/>
         </w:rPr>
-        <w:t xml:space="preserve">14. Conclusion</w:t>
-      </w:r>
-    </w:p>
-    <w:p>
-      <w:pPr>
-        <w:spacing w:after="240" w:before="240" w:lineRule="auto"/>
-        <w:rPr/>
-      </w:pPr>
-      <w:r>
-        <w:rPr>
-          <w:rtl w:val="0"/>
-        </w:rPr>
-        <w:t xml:space="preserve">The Task Manager application successfully meets the main requirements of Task 2.</w:t>
-      </w:r>
-    </w:p>
-    <w:p>
-      <w:pPr>
-        <w:spacing w:after="240" w:before="240" w:lineRule="auto"/>
-        <w:rPr/>
-      </w:pPr>
-      <w:r>
-        <w:rPr>
-          <w:rtl w:val="0"/>
-        </w:rPr>
-        <w:t xml:space="preserve">The application provides complete CRUD functionality, local data storage using Hive, state management using Cubit, responsive UI, search and filtering features, and persistent Light/Dark Mode.</w:t>
-      </w:r>
-    </w:p>
-    <w:p>
-      <w:pPr>
-        <w:spacing w:after="240" w:before="240" w:lineRule="auto"/>
-        <w:rPr/>
-      </w:pPr>
-      <w:r>
-        <w:rPr>
-          <w:rtl w:val="0"/>
-        </w:rPr>
-        <w:t xml:space="preserve">This task provided practical experience in building a functional Flutter application and working with local databases and state management.</w:t>
-      </w:r>
-    </w:p>
-    <w:p>
-      <w:pPr>
-        <w:bidi w:val="1"/>
-        <w:rPr/>
-      </w:pPr>
-      <w:r>
-        <w:rPr>
-          <w:rtl w:val="0"/>
-        </w:rPr>
+        <w:t xml:space="preserve">14. Screenshots</w:t>
+      </w:r>
+    </w:p>
+    <w:p>
+      <w:pPr>
+        <w:spacing w:after="240" w:before="240" w:lineRule="auto"/>
+        <w:rPr/>
+      </w:pPr>
+      <w:r>
+        <w:rPr>
+          <w:rtl w:val="0"/>
+        </w:rPr>
+        <w:t xml:space="preserve">The following screenshots demonstrate the main features of the application:</w:t>
+      </w:r>
+    </w:p>
+    <w:p>
+      <w:pPr>
+        <w:numPr>
+          <w:ilvl w:val="0"/>
+          <w:numId w:val="6"/>
+        </w:numPr>
+        <w:spacing w:after="0" w:afterAutospacing="0" w:before="240" w:lineRule="auto"/>
+        <w:ind w:left="720" w:hanging="360"/>
+      </w:pPr>
+      <w:r>
+        <w:rPr>
+          <w:rtl w:val="0"/>
+        </w:rPr>
+        <w:t xml:space="preserve">Home Screen - Light Mode</w:t>
+      </w:r>
+    </w:p>
+    <w:p>
+      <w:pPr>
+        <w:numPr>
+          <w:ilvl w:val="0"/>
+          <w:numId w:val="6"/>
+        </w:numPr>
+        <w:spacing w:after="0" w:afterAutospacing="0" w:before="0" w:beforeAutospacing="0" w:lineRule="auto"/>
+        <w:ind w:left="720" w:hanging="360"/>
+      </w:pPr>
+      <w:r>
+        <w:rPr>
+          <w:rtl w:val="0"/>
+        </w:rPr>
+        <w:t xml:space="preserve">Home Screen - Dark Mode</w:t>
+      </w:r>
+    </w:p>
+    <w:p>
+      <w:pPr>
+        <w:numPr>
+          <w:ilvl w:val="0"/>
+          <w:numId w:val="6"/>
+        </w:numPr>
+        <w:spacing w:after="0" w:afterAutospacing="0" w:before="0" w:beforeAutospacing="0" w:lineRule="auto"/>
+        <w:ind w:left="720" w:hanging="360"/>
+      </w:pPr>
+      <w:r>
+        <w:rPr>
+          <w:rtl w:val="0"/>
+        </w:rPr>
+        <w:t xml:space="preserve">Add Task</w:t>
+      </w:r>
+    </w:p>
+    <w:p>
+      <w:pPr>
+        <w:numPr>
+          <w:ilvl w:val="0"/>
+          <w:numId w:val="6"/>
+        </w:numPr>
+        <w:spacing w:after="0" w:afterAutospacing="0" w:before="0" w:beforeAutospacing="0" w:lineRule="auto"/>
+        <w:ind w:left="720" w:hanging="360"/>
+      </w:pPr>
+      <w:r>
+        <w:rPr>
+          <w:rtl w:val="0"/>
+        </w:rPr>
+        <w:t xml:space="preserve">Edit Task</w:t>
+      </w:r>
+    </w:p>
+    <w:p>
+      <w:pPr>
+        <w:numPr>
+          <w:ilvl w:val="0"/>
+          <w:numId w:val="6"/>
+        </w:numPr>
+        <w:spacing w:after="0" w:afterAutospacing="0" w:before="0" w:beforeAutospacing="0" w:lineRule="auto"/>
+        <w:ind w:left="720" w:hanging="360"/>
+      </w:pPr>
+      <w:r>
+        <w:rPr>
+          <w:rtl w:val="0"/>
+        </w:rPr>
+        <w:t xml:space="preserve">Search</w:t>
+      </w:r>
+    </w:p>
+    <w:p>
+      <w:pPr>
+        <w:numPr>
+          <w:ilvl w:val="0"/>
+          <w:numId w:val="6"/>
+        </w:numPr>
+        <w:spacing w:after="0" w:afterAutospacing="0" w:before="0" w:beforeAutospacing="0" w:lineRule="auto"/>
+        <w:ind w:left="720" w:hanging="360"/>
+      </w:pPr>
+      <w:r>
+        <w:rPr>
+          <w:rtl w:val="0"/>
+        </w:rPr>
+        <w:t xml:space="preserve">Pending Tasks</w:t>
+      </w:r>
+    </w:p>
+    <w:p>
+      <w:pPr>
+        <w:numPr>
+          <w:ilvl w:val="0"/>
+          <w:numId w:val="6"/>
+        </w:numPr>
+        <w:spacing w:after="0" w:afterAutospacing="0" w:before="0" w:beforeAutospacing="0" w:lineRule="auto"/>
+        <w:ind w:left="720" w:hanging="360"/>
+      </w:pPr>
+      <w:r>
+        <w:rPr>
+          <w:rtl w:val="0"/>
+        </w:rPr>
+        <w:t xml:space="preserve">Completed Tasks</w:t>
+      </w:r>
+    </w:p>
+    <w:p>
+      <w:pPr>
+        <w:numPr>
+          <w:ilvl w:val="0"/>
+          <w:numId w:val="6"/>
+        </w:numPr>
+        <w:spacing w:after="240" w:before="0" w:beforeAutospacing="0" w:lineRule="auto"/>
+        <w:ind w:left="720" w:hanging="360"/>
+      </w:pPr>
+      <w:r>
+        <w:rPr>
+          <w:rtl w:val="0"/>
+        </w:rPr>
+        <w:t xml:space="preserve">Delete Confirmation</w:t>
+      </w:r>
+    </w:p>
+    <w:p>
+      <w:pPr>
+        <w:spacing w:after="240" w:before="240" w:lineRule="auto"/>
+        <w:rPr/>
+      </w:pPr>
+      <w:r>
+        <w:pict>
+          <v:rect style="width:0.0pt;height:1.5pt" o:hr="t" o:hrstd="t" o:hralign="center" fillcolor="#A0A0A0" stroked="f"/>
+        </w:pict>
+      </w:r>
+      <w:r>
+        <w:rPr>
+          <w:rtl w:val="0"/>
+        </w:rPr>
+      </w:r>
+    </w:p>
+    <w:p>
+      <w:pPr>
+        <w:pStyle w:val="Heading2"/>
+        <w:keepNext w:val="0"/>
+        <w:keepLines w:val="0"/>
+        <w:spacing w:after="80" w:lineRule="auto"/>
+        <w:rPr>
+          <w:b w:val="1"/>
+          <w:bCs w:val="1"/>
+          <w:sz w:val="34"/>
+          <w:szCs w:val="34"/>
+        </w:rPr>
+      </w:pPr>
+      <w:bookmarkStart w:colFirst="0" w:colLast="0" w:name="_lxqy06tw8zcb" w:id="26"/>
+      <w:bookmarkEnd w:id="26"/>
+      <w:r>
+        <w:rPr>
+          <w:b w:val="1"/>
+          <w:bCs w:val="1"/>
+          <w:sz w:val="34"/>
+          <w:szCs w:val="34"/>
+          <w:rtl w:val="0"/>
+        </w:rPr>
+        <w:t xml:space="preserve">15. Challenges</w:t>
+      </w:r>
+    </w:p>
+    <w:p>
+      <w:pPr>
+        <w:spacing w:after="240" w:before="240" w:lineRule="auto"/>
+        <w:rPr/>
+      </w:pPr>
+      <w:r>
+        <w:rPr>
+          <w:rtl w:val="0"/>
+        </w:rPr>
+        <w:t xml:space="preserve">During development, I worked on several practical challenges, including:</w:t>
+      </w:r>
+    </w:p>
+    <w:p>
+      <w:pPr>
+        <w:numPr>
+          <w:ilvl w:val="0"/>
+          <w:numId w:val="1"/>
+        </w:numPr>
+        <w:spacing w:after="0" w:afterAutospacing="0" w:before="240" w:lineRule="auto"/>
+        <w:ind w:left="720" w:hanging="360"/>
+      </w:pPr>
+      <w:r>
+        <w:rPr>
+          <w:rtl w:val="0"/>
+        </w:rPr>
+        <w:t xml:space="preserve">Connecting the UI with local Hive storage.</w:t>
+      </w:r>
+    </w:p>
+    <w:p>
+      <w:pPr>
+        <w:numPr>
+          <w:ilvl w:val="0"/>
+          <w:numId w:val="1"/>
+        </w:numPr>
+        <w:spacing w:after="0" w:afterAutospacing="0" w:before="0" w:beforeAutospacing="0" w:lineRule="auto"/>
+        <w:ind w:left="720" w:hanging="360"/>
+      </w:pPr>
+      <w:r>
+        <w:rPr>
+          <w:rtl w:val="0"/>
+        </w:rPr>
+        <w:t xml:space="preserve">Implementing CRUD operations.</w:t>
+      </w:r>
+    </w:p>
+    <w:p>
+      <w:pPr>
+        <w:numPr>
+          <w:ilvl w:val="0"/>
+          <w:numId w:val="1"/>
+        </w:numPr>
+        <w:spacing w:after="0" w:afterAutospacing="0" w:before="0" w:beforeAutospacing="0" w:lineRule="auto"/>
+        <w:ind w:left="720" w:hanging="360"/>
+      </w:pPr>
+      <w:r>
+        <w:rPr>
+          <w:rtl w:val="0"/>
+        </w:rPr>
+        <w:t xml:space="preserve">Managing application state using Cubit.</w:t>
+      </w:r>
+    </w:p>
+    <w:p>
+      <w:pPr>
+        <w:numPr>
+          <w:ilvl w:val="0"/>
+          <w:numId w:val="1"/>
+        </w:numPr>
+        <w:spacing w:after="0" w:afterAutospacing="0" w:before="0" w:beforeAutospacing="0" w:lineRule="auto"/>
+        <w:ind w:left="720" w:hanging="360"/>
+      </w:pPr>
+      <w:r>
+        <w:rPr>
+          <w:rtl w:val="0"/>
+        </w:rPr>
+        <w:t xml:space="preserve">Updating the UI after database changes.</w:t>
+      </w:r>
+    </w:p>
+    <w:p>
+      <w:pPr>
+        <w:numPr>
+          <w:ilvl w:val="0"/>
+          <w:numId w:val="1"/>
+        </w:numPr>
+        <w:spacing w:after="0" w:afterAutospacing="0" w:before="0" w:beforeAutospacing="0" w:lineRule="auto"/>
+        <w:ind w:left="720" w:hanging="360"/>
+      </w:pPr>
+      <w:r>
+        <w:rPr>
+          <w:rtl w:val="0"/>
+        </w:rPr>
+        <w:t xml:space="preserve">Maintaining task data after application restart.</w:t>
+      </w:r>
+    </w:p>
+    <w:p>
+      <w:pPr>
+        <w:numPr>
+          <w:ilvl w:val="0"/>
+          <w:numId w:val="1"/>
+        </w:numPr>
+        <w:spacing w:after="0" w:afterAutospacing="0" w:before="0" w:beforeAutospacing="0" w:lineRule="auto"/>
+        <w:ind w:left="720" w:hanging="360"/>
+      </w:pPr>
+      <w:r>
+        <w:rPr>
+          <w:rtl w:val="0"/>
+        </w:rPr>
+        <w:t xml:space="preserve">Implementing persistent Light/Dark Mode.</w:t>
+      </w:r>
+    </w:p>
+    <w:p>
+      <w:pPr>
+        <w:numPr>
+          <w:ilvl w:val="0"/>
+          <w:numId w:val="1"/>
+        </w:numPr>
+        <w:spacing w:after="240" w:before="0" w:beforeAutospacing="0" w:lineRule="auto"/>
+        <w:ind w:left="720" w:hanging="360"/>
+      </w:pPr>
+      <w:r>
+        <w:rPr>
+          <w:rtl w:val="0"/>
+        </w:rPr>
+        <w:t xml:space="preserve">Creating a responsive layout for different screen sizes.</w:t>
+      </w:r>
+    </w:p>
+    <w:p>
+      <w:pPr>
+        <w:spacing w:after="240" w:before="240" w:lineRule="auto"/>
+        <w:rPr/>
+      </w:pPr>
+      <w:r>
+        <w:pict>
+          <v:rect style="width:0.0pt;height:1.5pt" o:hr="t" o:hrstd="t" o:hralign="center" fillcolor="#A0A0A0" stroked="f"/>
+        </w:pict>
+      </w:r>
+      <w:r>
+        <w:rPr>
+          <w:rtl w:val="0"/>
+        </w:rPr>
+      </w:r>
+    </w:p>
+    <w:p>
+      <w:pPr>
+        <w:pStyle w:val="Heading2"/>
+        <w:keepNext w:val="0"/>
+        <w:keepLines w:val="0"/>
+        <w:spacing w:after="80" w:lineRule="auto"/>
+        <w:rPr>
+          <w:b w:val="1"/>
+          <w:bCs w:val="1"/>
+          <w:sz w:val="34"/>
+          <w:szCs w:val="34"/>
+        </w:rPr>
+      </w:pPr>
+      <w:bookmarkStart w:colFirst="0" w:colLast="0" w:name="_siu23kadajpj" w:id="27"/>
+      <w:bookmarkEnd w:id="27"/>
+      <w:r>
+        <w:rPr>
+          <w:b w:val="1"/>
+          <w:bCs w:val="1"/>
+          <w:sz w:val="34"/>
+          <w:szCs w:val="34"/>
+          <w:rtl w:val="0"/>
+        </w:rPr>
+        <w:t xml:space="preserve">16. Conclusion</w:t>
+      </w:r>
+    </w:p>
+    <w:p>
+      <w:pPr>
+        <w:spacing w:after="240" w:before="240" w:lineRule="auto"/>
+        <w:rPr/>
+      </w:pPr>
+      <w:r>
+        <w:rPr>
+          <w:rtl w:val="0"/>
+        </w:rPr>
+        <w:t xml:space="preserve">The Task Manager application provides a complete task management experience with local data persistence, CRUD operations, state management, search, filtering, responsive design, and persistent Light/Dark Mode.</w:t>
+      </w:r>
+    </w:p>
+    <w:p>
+      <w:pPr>
+        <w:spacing w:after="240" w:before="240" w:lineRule="auto"/>
+        <w:rPr/>
+      </w:pPr>
+      <w:r>
+        <w:rPr>
+          <w:rtl w:val="0"/>
+        </w:rPr>
+        <w:t xml:space="preserve">The project provided practical experience in Flutter application development, local database integration, state management, and responsive user interface design.</w:t>
+      </w:r>
+    </w:p>
+    <w:p>
+      <w:pPr>
+        <w:spacing w:after="240" w:before="240" w:lineRule="auto"/>
+        <w:rPr/>
+      </w:pPr>
+      <w:r>
+        <w:pict>
+          <v:rect style="width:0.0pt;height:1.5pt" o:hr="t" o:hrstd="t" o:hralign="center" fillcolor="#A0A0A0" stroked="f"/>
+        </w:pict>
+      </w:r>
+      <w:r>
+        <w:rPr>
+          <w:rtl w:val="0"/>
+        </w:rPr>
+      </w:r>
+    </w:p>
+    <w:p>
+      <w:pPr>
+        <w:pStyle w:val="Heading2"/>
+        <w:keepNext w:val="0"/>
+        <w:keepLines w:val="0"/>
+        <w:spacing w:after="80" w:lineRule="auto"/>
+        <w:rPr>
+          <w:b w:val="1"/>
+          <w:bCs w:val="1"/>
+          <w:sz w:val="34"/>
+          <w:szCs w:val="34"/>
+        </w:rPr>
+      </w:pPr>
+      <w:bookmarkStart w:colFirst="0" w:colLast="0" w:name="_st79eqejjsgr" w:id="28"/>
+      <w:bookmarkEnd w:id="28"/>
+      <w:r>
+        <w:rPr>
+          <w:b w:val="1"/>
+          <w:bCs w:val="1"/>
+          <w:sz w:val="34"/>
+          <w:szCs w:val="34"/>
+          <w:rtl w:val="0"/>
+        </w:rPr>
+        <w:t xml:space="preserve">17. Future Improvements</w:t>
+      </w:r>
+    </w:p>
+    <w:p>
+      <w:pPr>
+        <w:spacing w:after="240" w:before="240" w:lineRule="auto"/>
+        <w:rPr/>
+      </w:pPr>
+      <w:r>
+        <w:rPr>
+          <w:rtl w:val="0"/>
+        </w:rPr>
+        <w:t xml:space="preserve">Possible future improvements include:</w:t>
+      </w:r>
+    </w:p>
+    <w:p>
+      <w:pPr>
+        <w:numPr>
+          <w:ilvl w:val="0"/>
+          <w:numId w:val="5"/>
+        </w:numPr>
+        <w:spacing w:after="0" w:afterAutospacing="0" w:before="240" w:lineRule="auto"/>
+        <w:ind w:left="720" w:hanging="360"/>
+      </w:pPr>
+      <w:r>
+        <w:rPr>
+          <w:rtl w:val="0"/>
+        </w:rPr>
+        <w:t xml:space="preserve">Cloud synchronization.</w:t>
+      </w:r>
+    </w:p>
+    <w:p>
+      <w:pPr>
+        <w:numPr>
+          <w:ilvl w:val="0"/>
+          <w:numId w:val="5"/>
+        </w:numPr>
+        <w:spacing w:after="0" w:afterAutospacing="0" w:before="0" w:beforeAutospacing="0" w:lineRule="auto"/>
+        <w:ind w:left="720" w:hanging="360"/>
+      </w:pPr>
+      <w:r>
+        <w:rPr>
+          <w:rtl w:val="0"/>
+        </w:rPr>
+        <w:t xml:space="preserve">User authentication.</w:t>
+      </w:r>
+    </w:p>
+    <w:p>
+      <w:pPr>
+        <w:numPr>
+          <w:ilvl w:val="0"/>
+          <w:numId w:val="5"/>
+        </w:numPr>
+        <w:spacing w:after="0" w:afterAutospacing="0" w:before="0" w:beforeAutospacing="0" w:lineRule="auto"/>
+        <w:ind w:left="720" w:hanging="360"/>
+      </w:pPr>
+      <w:r>
+        <w:rPr>
+          <w:rtl w:val="0"/>
+        </w:rPr>
+        <w:t xml:space="preserve">Push notifications for due dates.</w:t>
+      </w:r>
+    </w:p>
+    <w:p>
+      <w:pPr>
+        <w:numPr>
+          <w:ilvl w:val="0"/>
+          <w:numId w:val="5"/>
+        </w:numPr>
+        <w:spacing w:after="0" w:afterAutospacing="0" w:before="0" w:beforeAutospacing="0" w:lineRule="auto"/>
+        <w:ind w:left="720" w:hanging="360"/>
+      </w:pPr>
+      <w:r>
+        <w:rPr>
+          <w:rtl w:val="0"/>
+        </w:rPr>
+        <w:t xml:space="preserve">Categories and task priorities.</w:t>
+      </w:r>
+    </w:p>
+    <w:p>
+      <w:pPr>
+        <w:numPr>
+          <w:ilvl w:val="0"/>
+          <w:numId w:val="5"/>
+        </w:numPr>
+        <w:spacing w:after="0" w:afterAutospacing="0" w:before="0" w:beforeAutospacing="0" w:lineRule="auto"/>
+        <w:ind w:left="720" w:hanging="360"/>
+      </w:pPr>
+      <w:r>
+        <w:rPr>
+          <w:rtl w:val="0"/>
+        </w:rPr>
+        <w:t xml:space="preserve">Cloud backup.</w:t>
+      </w:r>
+    </w:p>
+    <w:p>
+      <w:pPr>
+        <w:numPr>
+          <w:ilvl w:val="0"/>
+          <w:numId w:val="5"/>
+        </w:numPr>
+        <w:spacing w:after="240" w:before="0" w:beforeAutospacing="0" w:lineRule="auto"/>
+        <w:ind w:left="720" w:hanging="360"/>
+      </w:pPr>
+      <w:r>
+        <w:rPr>
+          <w:rtl w:val="0"/>
+        </w:rPr>
+        <w:t xml:space="preserve">Multi-device synchronization.</w:t>
       </w:r>
     </w:p>
     <w:sectPr>
@@ -3981,6 +4281,336 @@
     </w:lvl>
   </w:abstractNum>
   <w:abstractNum w:abstractNumId="6">
+    <w:lvl w:ilvl="0">
+      <w:start w:val="1"/>
+      <w:numFmt w:val="bullet"/>
+      <w:lvlText w:val="●"/>
+      <w:lvlJc w:val="left"/>
+      <w:pPr>
+        <w:ind w:left="720" w:hanging="360"/>
+      </w:pPr>
+      <w:rPr>
+        <w:u w:val="none"/>
+      </w:rPr>
+    </w:lvl>
+    <w:lvl w:ilvl="1">
+      <w:start w:val="1"/>
+      <w:numFmt w:val="bullet"/>
+      <w:lvlText w:val="○"/>
+      <w:lvlJc w:val="left"/>
+      <w:pPr>
+        <w:ind w:left="1440" w:hanging="360"/>
+      </w:pPr>
+      <w:rPr>
+        <w:u w:val="none"/>
+      </w:rPr>
+    </w:lvl>
+    <w:lvl w:ilvl="2">
+      <w:start w:val="1"/>
+      <w:numFmt w:val="bullet"/>
+      <w:lvlText w:val="■"/>
+      <w:lvlJc w:val="left"/>
+      <w:pPr>
+        <w:ind w:left="2160" w:hanging="360"/>
+      </w:pPr>
+      <w:rPr>
+        <w:u w:val="none"/>
+      </w:rPr>
+    </w:lvl>
+    <w:lvl w:ilvl="3">
+      <w:start w:val="1"/>
+      <w:numFmt w:val="bullet"/>
+      <w:lvlText w:val="●"/>
+      <w:lvlJc w:val="left"/>
+      <w:pPr>
+        <w:ind w:left="2880" w:hanging="360"/>
+      </w:pPr>
+      <w:rPr>
+        <w:u w:val="none"/>
+      </w:rPr>
+    </w:lvl>
+    <w:lvl w:ilvl="4">
+      <w:start w:val="1"/>
+      <w:numFmt w:val="bullet"/>
+      <w:lvlText w:val="○"/>
+      <w:lvlJc w:val="left"/>
+      <w:pPr>
+        <w:ind w:left="3600" w:hanging="360"/>
+      </w:pPr>
+      <w:rPr>
+        <w:u w:val="none"/>
+      </w:rPr>
+    </w:lvl>
+    <w:lvl w:ilvl="5">
+      <w:start w:val="1"/>
+      <w:numFmt w:val="bullet"/>
+      <w:lvlText w:val="■"/>
+      <w:lvlJc w:val="left"/>
+      <w:pPr>
+        <w:ind w:left="4320" w:hanging="360"/>
+      </w:pPr>
+      <w:rPr>
+        <w:u w:val="none"/>
+      </w:rPr>
+    </w:lvl>
+    <w:lvl w:ilvl="6">
+      <w:start w:val="1"/>
+      <w:numFmt w:val="bullet"/>
+      <w:lvlText w:val="●"/>
+      <w:lvlJc w:val="left"/>
+      <w:pPr>
+        <w:ind w:left="5040" w:hanging="360"/>
+      </w:pPr>
+      <w:rPr>
+        <w:u w:val="none"/>
+      </w:rPr>
+    </w:lvl>
+    <w:lvl w:ilvl="7">
+      <w:start w:val="1"/>
+      <w:numFmt w:val="bullet"/>
+      <w:lvlText w:val="○"/>
+      <w:lvlJc w:val="left"/>
+      <w:pPr>
+        <w:ind w:left="5760" w:hanging="360"/>
+      </w:pPr>
+      <w:rPr>
+        <w:u w:val="none"/>
+      </w:rPr>
+    </w:lvl>
+    <w:lvl w:ilvl="8">
+      <w:start w:val="1"/>
+      <w:numFmt w:val="bullet"/>
+      <w:lvlText w:val="■"/>
+      <w:lvlJc w:val="left"/>
+      <w:pPr>
+        <w:ind w:left="6480" w:hanging="360"/>
+      </w:pPr>
+      <w:rPr>
+        <w:u w:val="none"/>
+      </w:rPr>
+    </w:lvl>
+  </w:abstractNum>
+  <w:abstractNum w:abstractNumId="7">
+    <w:lvl w:ilvl="0">
+      <w:start w:val="1"/>
+      <w:numFmt w:val="bullet"/>
+      <w:lvlText w:val="●"/>
+      <w:lvlJc w:val="left"/>
+      <w:pPr>
+        <w:ind w:left="720" w:hanging="360"/>
+      </w:pPr>
+      <w:rPr>
+        <w:u w:val="none"/>
+      </w:rPr>
+    </w:lvl>
+    <w:lvl w:ilvl="1">
+      <w:start w:val="1"/>
+      <w:numFmt w:val="bullet"/>
+      <w:lvlText w:val="○"/>
+      <w:lvlJc w:val="left"/>
+      <w:pPr>
+        <w:ind w:left="1440" w:hanging="360"/>
+      </w:pPr>
+      <w:rPr>
+        <w:u w:val="none"/>
+      </w:rPr>
+    </w:lvl>
+    <w:lvl w:ilvl="2">
+      <w:start w:val="1"/>
+      <w:numFmt w:val="bullet"/>
+      <w:lvlText w:val="■"/>
+      <w:lvlJc w:val="left"/>
+      <w:pPr>
+        <w:ind w:left="2160" w:hanging="360"/>
+      </w:pPr>
+      <w:rPr>
+        <w:u w:val="none"/>
+      </w:rPr>
+    </w:lvl>
+    <w:lvl w:ilvl="3">
+      <w:start w:val="1"/>
+      <w:numFmt w:val="bullet"/>
+      <w:lvlText w:val="●"/>
+      <w:lvlJc w:val="left"/>
+      <w:pPr>
+        <w:ind w:left="2880" w:hanging="360"/>
+      </w:pPr>
+      <w:rPr>
+        <w:u w:val="none"/>
+      </w:rPr>
+    </w:lvl>
+    <w:lvl w:ilvl="4">
+      <w:start w:val="1"/>
+      <w:numFmt w:val="bullet"/>
+      <w:lvlText w:val="○"/>
+      <w:lvlJc w:val="left"/>
+      <w:pPr>
+        <w:ind w:left="3600" w:hanging="360"/>
+      </w:pPr>
+      <w:rPr>
+        <w:u w:val="none"/>
+      </w:rPr>
+    </w:lvl>
+    <w:lvl w:ilvl="5">
+      <w:start w:val="1"/>
+      <w:numFmt w:val="bullet"/>
+      <w:lvlText w:val="■"/>
+      <w:lvlJc w:val="left"/>
+      <w:pPr>
+        <w:ind w:left="4320" w:hanging="360"/>
+      </w:pPr>
+      <w:rPr>
+        <w:u w:val="none"/>
+      </w:rPr>
+    </w:lvl>
+    <w:lvl w:ilvl="6">
+      <w:start w:val="1"/>
+      <w:numFmt w:val="bullet"/>
+      <w:lvlText w:val="●"/>
+      <w:lvlJc w:val="left"/>
+      <w:pPr>
+        <w:ind w:left="5040" w:hanging="360"/>
+      </w:pPr>
+      <w:rPr>
+        <w:u w:val="none"/>
+      </w:rPr>
+    </w:lvl>
+    <w:lvl w:ilvl="7">
+      <w:start w:val="1"/>
+      <w:numFmt w:val="bullet"/>
+      <w:lvlText w:val="○"/>
+      <w:lvlJc w:val="left"/>
+      <w:pPr>
+        <w:ind w:left="5760" w:hanging="360"/>
+      </w:pPr>
+      <w:rPr>
+        <w:u w:val="none"/>
+      </w:rPr>
+    </w:lvl>
+    <w:lvl w:ilvl="8">
+      <w:start w:val="1"/>
+      <w:numFmt w:val="bullet"/>
+      <w:lvlText w:val="■"/>
+      <w:lvlJc w:val="left"/>
+      <w:pPr>
+        <w:ind w:left="6480" w:hanging="360"/>
+      </w:pPr>
+      <w:rPr>
+        <w:u w:val="none"/>
+      </w:rPr>
+    </w:lvl>
+  </w:abstractNum>
+  <w:abstractNum w:abstractNumId="8">
+    <w:lvl w:ilvl="0">
+      <w:start w:val="1"/>
+      <w:numFmt w:val="bullet"/>
+      <w:lvlText w:val="●"/>
+      <w:lvlJc w:val="left"/>
+      <w:pPr>
+        <w:ind w:left="720" w:hanging="360"/>
+      </w:pPr>
+      <w:rPr>
+        <w:u w:val="none"/>
+      </w:rPr>
+    </w:lvl>
+    <w:lvl w:ilvl="1">
+      <w:start w:val="1"/>
+      <w:numFmt w:val="bullet"/>
+      <w:lvlText w:val="○"/>
+      <w:lvlJc w:val="left"/>
+      <w:pPr>
+        <w:ind w:left="1440" w:hanging="360"/>
+      </w:pPr>
+      <w:rPr>
+        <w:u w:val="none"/>
+      </w:rPr>
+    </w:lvl>
+    <w:lvl w:ilvl="2">
+      <w:start w:val="1"/>
+      <w:numFmt w:val="bullet"/>
+      <w:lvlText w:val="■"/>
+      <w:lvlJc w:val="left"/>
+      <w:pPr>
+        <w:ind w:left="2160" w:hanging="360"/>
+      </w:pPr>
+      <w:rPr>
+        <w:u w:val="none"/>
+      </w:rPr>
+    </w:lvl>
+    <w:lvl w:ilvl="3">
+      <w:start w:val="1"/>
+      <w:numFmt w:val="bullet"/>
+      <w:lvlText w:val="●"/>
+      <w:lvlJc w:val="left"/>
+      <w:pPr>
+        <w:ind w:left="2880" w:hanging="360"/>
+      </w:pPr>
+      <w:rPr>
+        <w:u w:val="none"/>
+      </w:rPr>
+    </w:lvl>
+    <w:lvl w:ilvl="4">
+      <w:start w:val="1"/>
+      <w:numFmt w:val="bullet"/>
+      <w:lvlText w:val="○"/>
+      <w:lvlJc w:val="left"/>
+      <w:pPr>
+        <w:ind w:left="3600" w:hanging="360"/>
+      </w:pPr>
+      <w:rPr>
+        <w:u w:val="none"/>
+      </w:rPr>
+    </w:lvl>
+    <w:lvl w:ilvl="5">
+      <w:start w:val="1"/>
+      <w:numFmt w:val="bullet"/>
+      <w:lvlText w:val="■"/>
+      <w:lvlJc w:val="left"/>
+      <w:pPr>
+        <w:ind w:left="4320" w:hanging="360"/>
+      </w:pPr>
+      <w:rPr>
+        <w:u w:val="none"/>
+      </w:rPr>
+    </w:lvl>
+    <w:lvl w:ilvl="6">
+      <w:start w:val="1"/>
+      <w:numFmt w:val="bullet"/>
+      <w:lvlText w:val="●"/>
+      <w:lvlJc w:val="left"/>
+      <w:pPr>
+        <w:ind w:left="5040" w:hanging="360"/>
+      </w:pPr>
+      <w:rPr>
+        <w:u w:val="none"/>
+      </w:rPr>
+    </w:lvl>
+    <w:lvl w:ilvl="7">
+      <w:start w:val="1"/>
+      <w:numFmt w:val="bullet"/>
+      <w:lvlText w:val="○"/>
+      <w:lvlJc w:val="left"/>
+      <w:pPr>
+        <w:ind w:left="5760" w:hanging="360"/>
+      </w:pPr>
+      <w:rPr>
+        <w:u w:val="none"/>
+      </w:rPr>
+    </w:lvl>
+    <w:lvl w:ilvl="8">
+      <w:start w:val="1"/>
+      <w:numFmt w:val="bullet"/>
+      <w:lvlText w:val="■"/>
+      <w:lvlJc w:val="left"/>
+      <w:pPr>
+        <w:ind w:left="6480" w:hanging="360"/>
+      </w:pPr>
+      <w:rPr>
+        <w:u w:val="none"/>
+      </w:rPr>
+    </w:lvl>
+  </w:abstractNum>
+  <w:abstractNum w:abstractNumId="9">
     <w:lvl w:ilvl="0">
       <w:start w:val="1"/>
       <w:numFmt w:val="bullet"/>
@@ -4107,6 +4737,15 @@
   </w:num>
   <w:num w:numId="6">
     <w:abstractNumId w:val="6"/>
+  </w:num>
+  <w:num w:numId="7">
+    <w:abstractNumId w:val="7"/>
+  </w:num>
+  <w:num w:numId="8">
+    <w:abstractNumId w:val="8"/>
+  </w:num>
+  <w:num w:numId="9">
+    <w:abstractNumId w:val="9"/>
   </w:num>
 </w:numbering>
 </file>

</xml_diff>